<commit_message>
Added all the questions to the Word document to make it easier to respond
</commit_message>
<xml_diff>
--- a/local/canadian-business-college/full-stack-web-application/assignment-project-content/Module9_Django/assignments/1/Django Assigment One - David Watson.docx
+++ b/local/canadian-business-college/full-stack-web-application/assignment-project-content/Module9_Django/assignments/1/Django Assigment One - David Watson.docx
@@ -102,9 +102,805 @@
         </w:rPr>
       </w:pPr>
     </w:p>
+    <w:p>
+      <w:pPr>
+        <w:rPr>
+          <w:b/>
+          <w:bCs/>
+          <w:sz w:val="28"/>
+          <w:szCs w:val="28"/>
+        </w:rPr>
+      </w:pPr>
+      <w:r>
+        <w:rPr>
+          <w:b/>
+          <w:bCs/>
+          <w:sz w:val="28"/>
+          <w:szCs w:val="28"/>
+        </w:rPr>
+        <w:t>2</w:t>
+      </w:r>
+      <w:r>
+        <w:rPr>
+          <w:b/>
+          <w:bCs/>
+          <w:sz w:val="28"/>
+          <w:szCs w:val="28"/>
+        </w:rPr>
+        <w:t xml:space="preserve">) </w:t>
+      </w:r>
+      <w:r>
+        <w:rPr>
+          <w:b/>
+          <w:bCs/>
+          <w:sz w:val="28"/>
+          <w:szCs w:val="28"/>
+        </w:rPr>
+        <w:t>What problems does Django solve for web developers?</w:t>
+      </w:r>
+    </w:p>
+    <w:p>
+      <w:pPr>
+        <w:rPr>
+          <w:i/>
+          <w:iCs/>
+          <w:sz w:val="28"/>
+          <w:szCs w:val="28"/>
+        </w:rPr>
+      </w:pPr>
+      <w:r>
+        <w:rPr>
+          <w:i/>
+          <w:iCs/>
+          <w:sz w:val="28"/>
+          <w:szCs w:val="28"/>
+        </w:rPr>
+        <w:t>Investigate features such as authentication, database handling, URL routing, forms, security, and the built-in admin panel.</w:t>
+      </w:r>
+    </w:p>
+    <w:p>
+      <w:pPr>
+        <w:rPr>
+          <w:sz w:val="28"/>
+          <w:szCs w:val="28"/>
+        </w:rPr>
+      </w:pPr>
+      <w:r>
+        <w:rPr>
+          <w:sz w:val="28"/>
+          <w:szCs w:val="28"/>
+        </w:rPr>
+        <w:t>Answer here.</w:t>
+      </w:r>
+    </w:p>
+    <w:p>
+      <w:pPr>
+        <w:rPr>
+          <w:sz w:val="28"/>
+          <w:szCs w:val="28"/>
+        </w:rPr>
+      </w:pPr>
+    </w:p>
+    <w:p>
+      <w:pPr>
+        <w:rPr>
+          <w:b/>
+          <w:bCs/>
+          <w:sz w:val="28"/>
+          <w:szCs w:val="28"/>
+        </w:rPr>
+      </w:pPr>
+      <w:r>
+        <w:rPr>
+          <w:b/>
+          <w:bCs/>
+          <w:sz w:val="28"/>
+          <w:szCs w:val="28"/>
+        </w:rPr>
+        <w:t>3</w:t>
+      </w:r>
+      <w:r>
+        <w:rPr>
+          <w:b/>
+          <w:bCs/>
+          <w:sz w:val="28"/>
+          <w:szCs w:val="28"/>
+        </w:rPr>
+        <w:t xml:space="preserve">) </w:t>
+      </w:r>
+      <w:r>
+        <w:rPr>
+          <w:b/>
+          <w:bCs/>
+          <w:sz w:val="28"/>
+          <w:szCs w:val="28"/>
+        </w:rPr>
+        <w:t>What types of applications are best suited for Django?</w:t>
+      </w:r>
+    </w:p>
+    <w:p>
+      <w:pPr>
+        <w:rPr>
+          <w:i/>
+          <w:iCs/>
+          <w:sz w:val="28"/>
+          <w:szCs w:val="28"/>
+        </w:rPr>
+      </w:pPr>
+      <w:r>
+        <w:rPr>
+          <w:i/>
+          <w:iCs/>
+          <w:sz w:val="28"/>
+          <w:szCs w:val="28"/>
+        </w:rPr>
+        <w:t>Research whether Django is better suited for websites, business applications, APIs, e-commerce, social networks, dashboards, or data-driven applications.</w:t>
+      </w:r>
+    </w:p>
+    <w:p>
+      <w:pPr>
+        <w:rPr>
+          <w:sz w:val="28"/>
+          <w:szCs w:val="28"/>
+        </w:rPr>
+      </w:pPr>
+      <w:r>
+        <w:rPr>
+          <w:sz w:val="28"/>
+          <w:szCs w:val="28"/>
+        </w:rPr>
+        <w:t>Answer here.</w:t>
+      </w:r>
+    </w:p>
+    <w:p>
+      <w:pPr>
+        <w:rPr>
+          <w:sz w:val="28"/>
+          <w:szCs w:val="28"/>
+        </w:rPr>
+      </w:pPr>
+    </w:p>
+    <w:p>
+      <w:pPr>
+        <w:rPr>
+          <w:b/>
+          <w:bCs/>
+          <w:sz w:val="28"/>
+          <w:szCs w:val="28"/>
+        </w:rPr>
+      </w:pPr>
+      <w:r>
+        <w:rPr>
+          <w:b/>
+          <w:bCs/>
+          <w:sz w:val="28"/>
+          <w:szCs w:val="28"/>
+        </w:rPr>
+        <w:t>4</w:t>
+      </w:r>
+      <w:r>
+        <w:rPr>
+          <w:b/>
+          <w:bCs/>
+          <w:sz w:val="28"/>
+          <w:szCs w:val="28"/>
+        </w:rPr>
+        <w:t xml:space="preserve">) </w:t>
+      </w:r>
+      <w:r>
+        <w:rPr>
+          <w:b/>
+          <w:bCs/>
+          <w:sz w:val="28"/>
+          <w:szCs w:val="28"/>
+        </w:rPr>
+        <w:t>What are the advantages and disadvantages of Django?</w:t>
+      </w:r>
+    </w:p>
+    <w:p>
+      <w:pPr>
+        <w:rPr>
+          <w:i/>
+          <w:iCs/>
+          <w:sz w:val="28"/>
+          <w:szCs w:val="28"/>
+        </w:rPr>
+      </w:pPr>
+      <w:r>
+        <w:rPr>
+          <w:i/>
+          <w:iCs/>
+          <w:sz w:val="28"/>
+          <w:szCs w:val="28"/>
+        </w:rPr>
+        <w:t>Identify at least </w:t>
+      </w:r>
+      <w:r>
+        <w:rPr>
+          <w:b/>
+          <w:bCs/>
+          <w:i/>
+          <w:iCs/>
+          <w:sz w:val="28"/>
+          <w:szCs w:val="28"/>
+        </w:rPr>
+        <w:t>5 advantages and 3 disadvantages</w:t>
+      </w:r>
+      <w:r>
+        <w:rPr>
+          <w:i/>
+          <w:iCs/>
+          <w:sz w:val="28"/>
+          <w:szCs w:val="28"/>
+        </w:rPr>
+        <w:t> of using Django in a real-world project.</w:t>
+      </w:r>
+    </w:p>
+    <w:p>
+      <w:pPr>
+        <w:rPr>
+          <w:sz w:val="28"/>
+          <w:szCs w:val="28"/>
+        </w:rPr>
+      </w:pPr>
+      <w:r>
+        <w:rPr>
+          <w:sz w:val="28"/>
+          <w:szCs w:val="28"/>
+        </w:rPr>
+        <w:t>Answer here.</w:t>
+      </w:r>
+    </w:p>
+    <w:p>
+      <w:pPr>
+        <w:rPr>
+          <w:sz w:val="28"/>
+          <w:szCs w:val="28"/>
+        </w:rPr>
+      </w:pPr>
+    </w:p>
+    <w:p>
+      <w:pPr>
+        <w:rPr>
+          <w:b/>
+          <w:bCs/>
+          <w:sz w:val="28"/>
+          <w:szCs w:val="28"/>
+        </w:rPr>
+      </w:pPr>
+      <w:r>
+        <w:rPr>
+          <w:b/>
+          <w:bCs/>
+          <w:sz w:val="28"/>
+          <w:szCs w:val="28"/>
+        </w:rPr>
+        <w:t>5</w:t>
+      </w:r>
+      <w:r>
+        <w:rPr>
+          <w:b/>
+          <w:bCs/>
+          <w:sz w:val="28"/>
+          <w:szCs w:val="28"/>
+        </w:rPr>
+        <w:t xml:space="preserve">) </w:t>
+      </w:r>
+      <w:r>
+        <w:rPr>
+          <w:b/>
+          <w:bCs/>
+          <w:sz w:val="28"/>
+          <w:szCs w:val="28"/>
+        </w:rPr>
+        <w:t>Which major companies use Django?</w:t>
+      </w:r>
+    </w:p>
+    <w:p>
+      <w:pPr>
+        <w:rPr>
+          <w:i/>
+          <w:iCs/>
+          <w:sz w:val="28"/>
+          <w:szCs w:val="28"/>
+        </w:rPr>
+      </w:pPr>
+      <w:r>
+        <w:rPr>
+          <w:i/>
+          <w:iCs/>
+          <w:sz w:val="28"/>
+          <w:szCs w:val="28"/>
+        </w:rPr>
+        <w:t>Research companies such as </w:t>
+      </w:r>
+      <w:r>
+        <w:rPr>
+          <w:b/>
+          <w:bCs/>
+          <w:i/>
+          <w:iCs/>
+          <w:sz w:val="28"/>
+          <w:szCs w:val="28"/>
+        </w:rPr>
+        <w:t>Instagram, Pinterest, Mozilla, Disqus, Bitbucket, and The Washington Post</w:t>
+      </w:r>
+      <w:r>
+        <w:rPr>
+          <w:i/>
+          <w:iCs/>
+          <w:sz w:val="28"/>
+          <w:szCs w:val="28"/>
+        </w:rPr>
+        <w:t>, and determine how Django is/was used in their technology stacks.</w:t>
+      </w:r>
+    </w:p>
+    <w:p>
+      <w:pPr>
+        <w:rPr>
+          <w:sz w:val="28"/>
+          <w:szCs w:val="28"/>
+        </w:rPr>
+      </w:pPr>
+      <w:r>
+        <w:rPr>
+          <w:sz w:val="28"/>
+          <w:szCs w:val="28"/>
+        </w:rPr>
+        <w:lastRenderedPageBreak/>
+        <w:t>Answer here.</w:t>
+      </w:r>
+    </w:p>
+    <w:p>
+      <w:pPr>
+        <w:rPr>
+          <w:sz w:val="28"/>
+          <w:szCs w:val="28"/>
+        </w:rPr>
+      </w:pPr>
+    </w:p>
+    <w:p>
+      <w:pPr>
+        <w:rPr>
+          <w:b/>
+          <w:bCs/>
+          <w:sz w:val="28"/>
+          <w:szCs w:val="28"/>
+        </w:rPr>
+      </w:pPr>
+      <w:r>
+        <w:rPr>
+          <w:b/>
+          <w:bCs/>
+          <w:sz w:val="28"/>
+          <w:szCs w:val="28"/>
+        </w:rPr>
+        <w:t>6</w:t>
+      </w:r>
+      <w:r>
+        <w:rPr>
+          <w:b/>
+          <w:bCs/>
+          <w:sz w:val="28"/>
+          <w:szCs w:val="28"/>
+        </w:rPr>
+        <w:t xml:space="preserve">) </w:t>
+      </w:r>
+      <w:r>
+        <w:rPr>
+          <w:b/>
+          <w:bCs/>
+          <w:sz w:val="28"/>
+          <w:szCs w:val="28"/>
+        </w:rPr>
+        <w:t>What real-world products have been built using Django?</w:t>
+      </w:r>
+    </w:p>
+    <w:p>
+      <w:pPr>
+        <w:rPr>
+          <w:i/>
+          <w:iCs/>
+          <w:sz w:val="28"/>
+          <w:szCs w:val="28"/>
+        </w:rPr>
+      </w:pPr>
+      <w:r>
+        <w:rPr>
+          <w:i/>
+          <w:iCs/>
+          <w:sz w:val="28"/>
+          <w:szCs w:val="28"/>
+        </w:rPr>
+        <w:t>Find at least </w:t>
+      </w:r>
+      <w:r>
+        <w:rPr>
+          <w:b/>
+          <w:bCs/>
+          <w:i/>
+          <w:iCs/>
+          <w:sz w:val="28"/>
+          <w:szCs w:val="28"/>
+        </w:rPr>
+        <w:t>5 real products or platforms</w:t>
+      </w:r>
+      <w:r>
+        <w:rPr>
+          <w:i/>
+          <w:iCs/>
+          <w:sz w:val="28"/>
+          <w:szCs w:val="28"/>
+        </w:rPr>
+        <w:t> built with Django and explain what each product does. Examples include social platforms, content platforms, commenting systems, and developer tools.</w:t>
+      </w:r>
+    </w:p>
+    <w:p>
+      <w:pPr>
+        <w:rPr>
+          <w:sz w:val="28"/>
+          <w:szCs w:val="28"/>
+        </w:rPr>
+      </w:pPr>
+      <w:r>
+        <w:rPr>
+          <w:sz w:val="28"/>
+          <w:szCs w:val="28"/>
+        </w:rPr>
+        <w:t>Answer here.</w:t>
+      </w:r>
+    </w:p>
+    <w:p>
+      <w:pPr>
+        <w:rPr>
+          <w:sz w:val="28"/>
+          <w:szCs w:val="28"/>
+        </w:rPr>
+      </w:pPr>
+    </w:p>
+    <w:p>
+      <w:pPr>
+        <w:rPr>
+          <w:b/>
+          <w:bCs/>
+          <w:sz w:val="28"/>
+          <w:szCs w:val="28"/>
+        </w:rPr>
+      </w:pPr>
+      <w:r>
+        <w:rPr>
+          <w:b/>
+          <w:bCs/>
+          <w:sz w:val="28"/>
+          <w:szCs w:val="28"/>
+        </w:rPr>
+        <w:t>7</w:t>
+      </w:r>
+      <w:r>
+        <w:rPr>
+          <w:b/>
+          <w:bCs/>
+          <w:sz w:val="28"/>
+          <w:szCs w:val="28"/>
+        </w:rPr>
+        <w:t xml:space="preserve">) </w:t>
+      </w:r>
+      <w:r>
+        <w:rPr>
+          <w:b/>
+          <w:bCs/>
+          <w:sz w:val="28"/>
+          <w:szCs w:val="28"/>
+        </w:rPr>
+        <w:t>Can Django handle millions of users?</w:t>
+      </w:r>
+    </w:p>
+    <w:p>
+      <w:pPr>
+        <w:rPr>
+          <w:i/>
+          <w:iCs/>
+          <w:sz w:val="28"/>
+          <w:szCs w:val="28"/>
+        </w:rPr>
+      </w:pPr>
+      <w:r>
+        <w:rPr>
+          <w:i/>
+          <w:iCs/>
+          <w:sz w:val="28"/>
+          <w:szCs w:val="28"/>
+        </w:rPr>
+        <w:t>Research how Django applications scale and investigate examples of high-traffic websites that have used Django. Explain what additional technologies—such as caching, databases, load balancing, background workers, or APIs—may be required.</w:t>
+      </w:r>
+    </w:p>
+    <w:p>
+      <w:pPr>
+        <w:rPr>
+          <w:sz w:val="28"/>
+          <w:szCs w:val="28"/>
+        </w:rPr>
+      </w:pPr>
+      <w:r>
+        <w:rPr>
+          <w:sz w:val="28"/>
+          <w:szCs w:val="28"/>
+        </w:rPr>
+        <w:t>Answer here.</w:t>
+      </w:r>
+    </w:p>
+    <w:p>
+      <w:pPr>
+        <w:rPr>
+          <w:sz w:val="28"/>
+          <w:szCs w:val="28"/>
+        </w:rPr>
+      </w:pPr>
+    </w:p>
+    <w:p>
+      <w:pPr>
+        <w:rPr>
+          <w:b/>
+          <w:bCs/>
+          <w:sz w:val="28"/>
+          <w:szCs w:val="28"/>
+        </w:rPr>
+      </w:pPr>
+      <w:r>
+        <w:rPr>
+          <w:b/>
+          <w:bCs/>
+          <w:sz w:val="28"/>
+          <w:szCs w:val="28"/>
+        </w:rPr>
+        <w:t>8</w:t>
+      </w:r>
+      <w:r>
+        <w:rPr>
+          <w:b/>
+          <w:bCs/>
+          <w:sz w:val="28"/>
+          <w:szCs w:val="28"/>
+        </w:rPr>
+        <w:t xml:space="preserve">) </w:t>
+      </w:r>
+      <w:r>
+        <w:rPr>
+          <w:b/>
+          <w:bCs/>
+          <w:sz w:val="28"/>
+          <w:szCs w:val="28"/>
+        </w:rPr>
+        <w:t>Why is Django popular for data-driven applications?</w:t>
+      </w:r>
+    </w:p>
+    <w:p>
+      <w:pPr>
+        <w:rPr>
+          <w:i/>
+          <w:iCs/>
+          <w:sz w:val="28"/>
+          <w:szCs w:val="28"/>
+        </w:rPr>
+      </w:pPr>
+      <w:r>
+        <w:rPr>
+          <w:i/>
+          <w:iCs/>
+          <w:sz w:val="28"/>
+          <w:szCs w:val="28"/>
+        </w:rPr>
+        <w:t>Research Django's ORM, database support, admin interface, and Python ecosystem. Explain why these features can be useful for applications that work with large amounts of structured data.</w:t>
+      </w:r>
+    </w:p>
+    <w:p>
+      <w:pPr>
+        <w:rPr>
+          <w:sz w:val="28"/>
+          <w:szCs w:val="28"/>
+        </w:rPr>
+      </w:pPr>
+      <w:r>
+        <w:rPr>
+          <w:sz w:val="28"/>
+          <w:szCs w:val="28"/>
+        </w:rPr>
+        <w:t>Answer here.</w:t>
+      </w:r>
+    </w:p>
+    <w:p>
+      <w:pPr>
+        <w:rPr>
+          <w:sz w:val="28"/>
+          <w:szCs w:val="28"/>
+        </w:rPr>
+      </w:pPr>
+    </w:p>
+    <w:p>
+      <w:pPr>
+        <w:rPr>
+          <w:b/>
+          <w:bCs/>
+          <w:sz w:val="28"/>
+          <w:szCs w:val="28"/>
+        </w:rPr>
+      </w:pPr>
+      <w:r>
+        <w:rPr>
+          <w:b/>
+          <w:bCs/>
+          <w:sz w:val="28"/>
+          <w:szCs w:val="28"/>
+        </w:rPr>
+        <w:t>9</w:t>
+      </w:r>
+      <w:r>
+        <w:rPr>
+          <w:b/>
+          <w:bCs/>
+          <w:sz w:val="28"/>
+          <w:szCs w:val="28"/>
+        </w:rPr>
+        <w:t xml:space="preserve">) </w:t>
+      </w:r>
+      <w:r>
+        <w:rPr>
+          <w:b/>
+          <w:bCs/>
+          <w:sz w:val="28"/>
+          <w:szCs w:val="28"/>
+        </w:rPr>
+        <w:t>Django vs Flask vs Node.js: Which should a company choose?</w:t>
+      </w:r>
+    </w:p>
+    <w:p>
+      <w:pPr>
+        <w:rPr>
+          <w:i/>
+          <w:iCs/>
+          <w:sz w:val="28"/>
+          <w:szCs w:val="28"/>
+        </w:rPr>
+      </w:pPr>
+      <w:r>
+        <w:rPr>
+          <w:i/>
+          <w:iCs/>
+          <w:sz w:val="28"/>
+          <w:szCs w:val="28"/>
+        </w:rPr>
+        <w:t>Compare Django with Flask and Node.js/Express based on </w:t>
+      </w:r>
+      <w:r>
+        <w:rPr>
+          <w:b/>
+          <w:bCs/>
+          <w:i/>
+          <w:iCs/>
+          <w:sz w:val="28"/>
+          <w:szCs w:val="28"/>
+        </w:rPr>
+        <w:t>development speed, scalability, security, database support, learning curve, ecosystem, and typical use cases</w:t>
+      </w:r>
+      <w:r>
+        <w:rPr>
+          <w:i/>
+          <w:iCs/>
+          <w:sz w:val="28"/>
+          <w:szCs w:val="28"/>
+        </w:rPr>
+        <w:t>.</w:t>
+      </w:r>
+    </w:p>
+    <w:p>
+      <w:pPr>
+        <w:rPr>
+          <w:sz w:val="28"/>
+          <w:szCs w:val="28"/>
+        </w:rPr>
+      </w:pPr>
+      <w:r>
+        <w:rPr>
+          <w:sz w:val="28"/>
+          <w:szCs w:val="28"/>
+        </w:rPr>
+        <w:t>Answer here.</w:t>
+      </w:r>
+    </w:p>
+    <w:p>
+      <w:pPr>
+        <w:rPr>
+          <w:sz w:val="28"/>
+          <w:szCs w:val="28"/>
+        </w:rPr>
+      </w:pPr>
+    </w:p>
+    <w:p>
+      <w:pPr>
+        <w:rPr>
+          <w:b/>
+          <w:bCs/>
+          <w:sz w:val="28"/>
+          <w:szCs w:val="28"/>
+        </w:rPr>
+      </w:pPr>
+      <w:r>
+        <w:rPr>
+          <w:b/>
+          <w:bCs/>
+          <w:sz w:val="28"/>
+          <w:szCs w:val="28"/>
+        </w:rPr>
+        <w:lastRenderedPageBreak/>
+        <w:t>10</w:t>
+      </w:r>
+      <w:r>
+        <w:rPr>
+          <w:b/>
+          <w:bCs/>
+          <w:sz w:val="28"/>
+          <w:szCs w:val="28"/>
+        </w:rPr>
+        <w:t xml:space="preserve">) </w:t>
+      </w:r>
+      <w:r>
+        <w:rPr>
+          <w:b/>
+          <w:bCs/>
+          <w:sz w:val="28"/>
+          <w:szCs w:val="28"/>
+        </w:rPr>
+        <w:t>Is Django still relevant for modern software development?</w:t>
+      </w:r>
+    </w:p>
+    <w:p>
+      <w:pPr>
+        <w:rPr>
+          <w:i/>
+          <w:iCs/>
+          <w:sz w:val="28"/>
+          <w:szCs w:val="28"/>
+        </w:rPr>
+      </w:pPr>
+      <w:r>
+        <w:rPr>
+          <w:i/>
+          <w:iCs/>
+          <w:sz w:val="28"/>
+          <w:szCs w:val="28"/>
+        </w:rPr>
+        <w:t>Research Django's current adoption, community, job market, recent releases, API development, cloud deployment, AI integration, and real-world use in 2026. Then give your own conclusion: </w:t>
+      </w:r>
+      <w:r>
+        <w:rPr>
+          <w:b/>
+          <w:bCs/>
+          <w:i/>
+          <w:iCs/>
+          <w:sz w:val="28"/>
+          <w:szCs w:val="28"/>
+        </w:rPr>
+        <w:t>Would you choose Django for a new project today, and why?</w:t>
+      </w:r>
+    </w:p>
+    <w:p>
+      <w:pPr>
+        <w:rPr>
+          <w:sz w:val="28"/>
+          <w:szCs w:val="28"/>
+        </w:rPr>
+      </w:pPr>
+      <w:r>
+        <w:rPr>
+          <w:sz w:val="28"/>
+          <w:szCs w:val="28"/>
+        </w:rPr>
+        <w:t>Answer here.</w:t>
+      </w:r>
+    </w:p>
     <w:sectPr>
       <w:pgSz w:w="12240" w:h="15840"/>
-      <w:pgMar w:top="1440" w:right="1440" w:bottom="1440" w:left="1440" w:header="708" w:footer="708" w:gutter="0"/>
+      <w:pgMar w:top="1440" w:right="1440" w:bottom="568" w:left="1440" w:header="708" w:footer="708" w:gutter="0"/>
       <w:cols w:space="708"/>
       <w:docGrid w:linePitch="360"/>
     </w:sectPr>

</xml_diff>

<commit_message>
Answered questions 1-4 and 8
</commit_message>
<xml_diff>
--- a/local/canadian-business-college/full-stack-web-application/assignment-project-content/Module9_Django/assignments/1/Django Assigment One - David Watson.docx
+++ b/local/canadian-business-college/full-stack-web-application/assignment-project-content/Module9_Django/assignments/1/Django Assigment One - David Watson.docx
@@ -1,6 +1,6 @@
 
 <file path=word/document.xml><?xml version="1.0" encoding="utf-8"?>
-<w:document xmlns:wpc="http://schemas.microsoft.com/office/word/2010/wordprocessingCanvas" xmlns:cx="http://schemas.microsoft.com/office/drawing/2014/chartex" xmlns:cx1="http://schemas.microsoft.com/office/drawing/2015/9/8/chartex" xmlns:cx2="http://schemas.microsoft.com/office/drawing/2015/10/21/chartex" xmlns:cx3="http://schemas.microsoft.com/office/drawing/2016/5/9/chartex" xmlns:cx4="http://schemas.microsoft.com/office/drawing/2016/5/10/chartex" xmlns:cx5="http://schemas.microsoft.com/office/drawing/2016/5/11/chartex" xmlns:cx6="http://schemas.microsoft.com/office/drawing/2016/5/12/chartex" xmlns:cx7="http://schemas.microsoft.com/office/drawing/2016/5/13/chartex" xmlns:cx8="http://schemas.microsoft.com/office/drawing/2016/5/14/chartex" xmlns:mc="http://schemas.openxmlformats.org/markup-compatibility/2006" xmlns:aink="http://schemas.microsoft.com/office/drawing/2016/ink" xmlns:am3d="http://schemas.microsoft.com/office/drawing/2017/model3d" xmlns:o="urn:schemas-microsoft-com:office:office" xmlns:oel="http://schemas.microsoft.com/office/2019/extlst" xmlns:r="http://schemas.openxmlformats.org/officeDocument/2006/relationships" xmlns:m="http://schemas.openxmlformats.org/officeDocument/2006/math" xmlns:v="urn:schemas-microsoft-com:vml" xmlns:wp14="http://schemas.microsoft.com/office/word/2010/wordprocessingDrawing" xmlns:wp="http://schemas.openxmlformats.org/drawingml/2006/wordprocessingDrawing" xmlns:w10="urn:schemas-microsoft-com:office:word" xmlns:w="http://schemas.openxmlformats.org/wordprocessingml/2006/main" xmlns:w14="http://schemas.microsoft.com/office/word/2010/wordml" xmlns:w15="http://schemas.microsoft.com/office/word/2012/wordml" xmlns:w16cei="http://schemas.microsoft.com/office/word/2026/wordml/cei" xmlns:w16cex="http://schemas.microsoft.com/office/word/2018/wordml/cex" xmlns:w16cid="http://schemas.microsoft.com/office/word/2016/wordml/cid" xmlns:w16="http://schemas.microsoft.com/office/word/2018/wordml" xmlns:w16du="http://schemas.microsoft.com/office/word/2023/wordml/word16du" xmlns:w16sdtdh="http://schemas.microsoft.com/office/word/2020/wordml/sdtdatahash" xmlns:w16sdtfl="http://schemas.microsoft.com/office/word/2024/wordml/sdtformatlock" xmlns:w16se="http://schemas.microsoft.com/office/word/2015/wordml/symex" xmlns:wpg="http://schemas.microsoft.com/office/word/2010/wordprocessingGroup" xmlns:wpi="http://schemas.microsoft.com/office/word/2010/wordprocessingInk" xmlns:wne="http://schemas.microsoft.com/office/word/2006/wordml" xmlns:wps="http://schemas.microsoft.com/office/word/2010/wordprocessingShape" mc:Ignorable="w14 w15 w16se w16cid w16 w16cex w16sdtdh w16sdtfl w16du wp14">
+<w:document xmlns:wpc="http://schemas.microsoft.com/office/word/2010/wordprocessingCanvas" xmlns:cx="http://schemas.microsoft.com/office/drawing/2014/chartex" xmlns:cx1="http://schemas.microsoft.com/office/drawing/2015/9/8/chartex" xmlns:cx2="http://schemas.microsoft.com/office/drawing/2015/10/21/chartex" xmlns:cx3="http://schemas.microsoft.com/office/drawing/2016/5/9/chartex" xmlns:cx4="http://schemas.microsoft.com/office/drawing/2016/5/10/chartex" xmlns:cx5="http://schemas.microsoft.com/office/drawing/2016/5/11/chartex" xmlns:cx6="http://schemas.microsoft.com/office/drawing/2016/5/12/chartex" xmlns:cx7="http://schemas.microsoft.com/office/drawing/2016/5/13/chartex" xmlns:cx8="http://schemas.microsoft.com/office/drawing/2016/5/14/chartex" xmlns:mc="http://schemas.openxmlformats.org/markup-compatibility/2006" xmlns:aink="http://schemas.microsoft.com/office/drawing/2016/ink" xmlns:am3d="http://schemas.microsoft.com/office/drawing/2017/model3d" xmlns:o="urn:schemas-microsoft-com:office:office" xmlns:oel="http://schemas.microsoft.com/office/2019/extlst" xmlns:r="http://schemas.openxmlformats.org/officeDocument/2006/relationships" xmlns:m="http://schemas.openxmlformats.org/officeDocument/2006/math" xmlns:v="urn:schemas-microsoft-com:vml" xmlns:wp14="http://schemas.microsoft.com/office/word/2010/wordprocessingDrawing" xmlns:wp="http://schemas.openxmlformats.org/drawingml/2006/wordprocessingDrawing" xmlns:w10="urn:schemas-microsoft-com:office:word" xmlns:w="http://schemas.openxmlformats.org/wordprocessingml/2006/main" xmlns:w14="http://schemas.microsoft.com/office/word/2010/wordml" xmlns:w15="http://schemas.microsoft.com/office/word/2012/wordml" xmlns:w16cex="http://schemas.microsoft.com/office/word/2018/wordml/cex" xmlns:w16cid="http://schemas.microsoft.com/office/word/2016/wordml/cid" xmlns:w16="http://schemas.microsoft.com/office/word/2018/wordml" xmlns:w16du="http://schemas.microsoft.com/office/word/2023/wordml/word16du" xmlns:w16sdtdh="http://schemas.microsoft.com/office/word/2020/wordml/sdtdatahash" xmlns:w16sdtfl="http://schemas.microsoft.com/office/word/2024/wordml/sdtformatlock" xmlns:w16se="http://schemas.microsoft.com/office/word/2015/wordml/symex" xmlns:wpg="http://schemas.microsoft.com/office/word/2010/wordprocessingGroup" xmlns:wpi="http://schemas.microsoft.com/office/word/2010/wordprocessingInk" xmlns:wne="http://schemas.microsoft.com/office/word/2006/wordml" xmlns:wps="http://schemas.microsoft.com/office/word/2010/wordprocessingShape" mc:Ignorable="w14 w15 w16se w16cid w16 w16cex w16sdtdh w16sdtfl w16du wp14">
   <w:body>
     <w:p>
       <w:pPr>
@@ -91,43 +91,34 @@
           <w:sz w:val="28"/>
           <w:szCs w:val="28"/>
         </w:rPr>
-        <w:t>Answer here.</w:t>
-      </w:r>
-    </w:p>
-    <w:p>
-      <w:pPr>
-        <w:rPr>
-          <w:sz w:val="28"/>
-          <w:szCs w:val="28"/>
-        </w:rPr>
-      </w:pPr>
-    </w:p>
-    <w:p>
-      <w:pPr>
-        <w:rPr>
-          <w:b/>
-          <w:bCs/>
-          <w:sz w:val="28"/>
-          <w:szCs w:val="28"/>
-        </w:rPr>
-      </w:pPr>
-      <w:r>
-        <w:rPr>
-          <w:b/>
-          <w:bCs/>
-          <w:sz w:val="28"/>
-          <w:szCs w:val="28"/>
-        </w:rPr>
-        <w:t>2</w:t>
-      </w:r>
-      <w:r>
-        <w:rPr>
-          <w:b/>
-          <w:bCs/>
-          <w:sz w:val="28"/>
-          <w:szCs w:val="28"/>
-        </w:rPr>
-        <w:t xml:space="preserve">) </w:t>
+        <w:t>Django is a full-fledged web framework, which means Django comes with the basic or common functionality of a web server built-in. This includes handling receiving HTTP requests and sending HTTP responses, handling endpoint routing, handling requests that include form data and other special data (ex., files, etc.), having a built-in templating system that easily allows dynamic data to be inserted into static HTML code before being sent back as a response, handling the low-level aspects of creating and maintaining a database connection, and more. All of this allows a developer to focus on the main logic and UI parts of a web application. If a developer had to build a web application from scratch, all those functions listed above – in fact, every aspect of a dynamic web server – would have to be programmed in before any application specific code can be added.</w:t>
+      </w:r>
+    </w:p>
+    <w:p>
+      <w:pPr>
+        <w:rPr>
+          <w:sz w:val="28"/>
+          <w:szCs w:val="28"/>
+        </w:rPr>
+      </w:pPr>
+    </w:p>
+    <w:p>
+      <w:pPr>
+        <w:rPr>
+          <w:b/>
+          <w:bCs/>
+          <w:sz w:val="28"/>
+          <w:szCs w:val="28"/>
+        </w:rPr>
+      </w:pPr>
+      <w:r>
+        <w:rPr>
+          <w:b/>
+          <w:bCs/>
+          <w:sz w:val="28"/>
+          <w:szCs w:val="28"/>
+        </w:rPr>
+        <w:t xml:space="preserve">2) </w:t>
       </w:r>
       <w:r>
         <w:rPr>
@@ -170,43 +161,42 @@
           <w:sz w:val="28"/>
           <w:szCs w:val="28"/>
         </w:rPr>
-        <w:t>Answer here.</w:t>
-      </w:r>
-    </w:p>
-    <w:p>
-      <w:pPr>
-        <w:rPr>
-          <w:sz w:val="28"/>
-          <w:szCs w:val="28"/>
-        </w:rPr>
-      </w:pPr>
-    </w:p>
-    <w:p>
-      <w:pPr>
-        <w:rPr>
-          <w:b/>
-          <w:bCs/>
-          <w:sz w:val="28"/>
-          <w:szCs w:val="28"/>
-        </w:rPr>
-      </w:pPr>
-      <w:r>
-        <w:rPr>
-          <w:b/>
-          <w:bCs/>
-          <w:sz w:val="28"/>
-          <w:szCs w:val="28"/>
-        </w:rPr>
-        <w:t>3</w:t>
-      </w:r>
-      <w:r>
-        <w:rPr>
-          <w:b/>
-          <w:bCs/>
-          <w:sz w:val="28"/>
-          <w:szCs w:val="28"/>
-        </w:rPr>
-        <w:t xml:space="preserve">) </w:t>
+        <w:t>Django provides many features out-of-the-box. As a full-fledged framework, Django pvoides the ability to hand URL routing, form data, provide security and authentication, connect to and work with a databas</w:t>
+      </w:r>
+      <w:r>
+        <w:rPr>
+          <w:sz w:val="28"/>
+          <w:szCs w:val="28"/>
+        </w:rPr>
+        <w:t>e, and create dynamic content responses. Django also has a built-in admin panel that can be set up to allow for site user administration. Having all of these features built in means that developers don’t have to worry about creating these capabilities from scratch. It also means that developers don’t have to search for third-party Python libraries that provide these features, nor worry about combining libraries or learning the specific API for each library.</w:t>
+      </w:r>
+    </w:p>
+    <w:p>
+      <w:pPr>
+        <w:rPr>
+          <w:sz w:val="28"/>
+          <w:szCs w:val="28"/>
+        </w:rPr>
+      </w:pPr>
+    </w:p>
+    <w:p>
+      <w:pPr>
+        <w:rPr>
+          <w:b/>
+          <w:bCs/>
+          <w:sz w:val="28"/>
+          <w:szCs w:val="28"/>
+        </w:rPr>
+      </w:pPr>
+      <w:r>
+        <w:rPr>
+          <w:b/>
+          <w:bCs/>
+          <w:sz w:val="28"/>
+          <w:szCs w:val="28"/>
+        </w:rPr>
+        <w:lastRenderedPageBreak/>
+        <w:t xml:space="preserve">3) </w:t>
       </w:r>
       <w:r>
         <w:rPr>
@@ -249,43 +239,34 @@
           <w:sz w:val="28"/>
           <w:szCs w:val="28"/>
         </w:rPr>
-        <w:t>Answer here.</w:t>
-      </w:r>
-    </w:p>
-    <w:p>
-      <w:pPr>
-        <w:rPr>
-          <w:sz w:val="28"/>
-          <w:szCs w:val="28"/>
-        </w:rPr>
-      </w:pPr>
-    </w:p>
-    <w:p>
-      <w:pPr>
-        <w:rPr>
-          <w:b/>
-          <w:bCs/>
-          <w:sz w:val="28"/>
-          <w:szCs w:val="28"/>
-        </w:rPr>
-      </w:pPr>
-      <w:r>
-        <w:rPr>
-          <w:b/>
-          <w:bCs/>
-          <w:sz w:val="28"/>
-          <w:szCs w:val="28"/>
-        </w:rPr>
-        <w:t>4</w:t>
-      </w:r>
-      <w:r>
-        <w:rPr>
-          <w:b/>
-          <w:bCs/>
-          <w:sz w:val="28"/>
-          <w:szCs w:val="28"/>
-        </w:rPr>
-        <w:t xml:space="preserve">) </w:t>
+        <w:t>According to my research, Django is best suited for large-scale web applications that are heavily driven by data content. Some examples given are social networks and streaming services, but any site or application that will generate and/or need to manage large amounts of data will benefit from being built in Django.</w:t>
+      </w:r>
+    </w:p>
+    <w:p>
+      <w:pPr>
+        <w:rPr>
+          <w:sz w:val="28"/>
+          <w:szCs w:val="28"/>
+        </w:rPr>
+      </w:pPr>
+    </w:p>
+    <w:p>
+      <w:pPr>
+        <w:rPr>
+          <w:b/>
+          <w:bCs/>
+          <w:sz w:val="28"/>
+          <w:szCs w:val="28"/>
+        </w:rPr>
+      </w:pPr>
+      <w:r>
+        <w:rPr>
+          <w:b/>
+          <w:bCs/>
+          <w:sz w:val="28"/>
+          <w:szCs w:val="28"/>
+        </w:rPr>
+        <w:t xml:space="preserve">4) </w:t>
       </w:r>
       <w:r>
         <w:rPr>
@@ -348,43 +329,238 @@
           <w:sz w:val="28"/>
           <w:szCs w:val="28"/>
         </w:rPr>
-        <w:t>Answer here.</w:t>
-      </w:r>
-    </w:p>
-    <w:p>
-      <w:pPr>
-        <w:rPr>
-          <w:sz w:val="28"/>
-          <w:szCs w:val="28"/>
-        </w:rPr>
-      </w:pPr>
-    </w:p>
-    <w:p>
-      <w:pPr>
-        <w:rPr>
-          <w:b/>
-          <w:bCs/>
-          <w:sz w:val="28"/>
-          <w:szCs w:val="28"/>
-        </w:rPr>
-      </w:pPr>
-      <w:r>
-        <w:rPr>
-          <w:b/>
-          <w:bCs/>
-          <w:sz w:val="28"/>
-          <w:szCs w:val="28"/>
-        </w:rPr>
-        <w:t>5</w:t>
-      </w:r>
-      <w:r>
-        <w:rPr>
-          <w:b/>
-          <w:bCs/>
-          <w:sz w:val="28"/>
-          <w:szCs w:val="28"/>
-        </w:rPr>
-        <w:t xml:space="preserve">) </w:t>
+        <w:t>Advantages:</w:t>
+      </w:r>
+    </w:p>
+    <w:p>
+      <w:pPr>
+        <w:pStyle w:val="ListParagraph"/>
+        <w:numPr>
+          <w:ilvl w:val="0"/>
+          <w:numId w:val="9"/>
+        </w:numPr>
+        <w:rPr>
+          <w:sz w:val="28"/>
+          <w:szCs w:val="28"/>
+        </w:rPr>
+      </w:pPr>
+      <w:r>
+        <w:rPr>
+          <w:sz w:val="28"/>
+          <w:szCs w:val="28"/>
+        </w:rPr>
+        <w:t xml:space="preserve">Django is built for enterprise </w:t>
+      </w:r>
+      <w:r>
+        <w:rPr>
+          <w:sz w:val="28"/>
+          <w:szCs w:val="28"/>
+        </w:rPr>
+        <w:t>level applications and sites. This means Django can handle hundreds of connections without the server being affected.</w:t>
+      </w:r>
+    </w:p>
+    <w:p>
+      <w:pPr>
+        <w:pStyle w:val="ListParagraph"/>
+        <w:numPr>
+          <w:ilvl w:val="0"/>
+          <w:numId w:val="9"/>
+        </w:numPr>
+        <w:rPr>
+          <w:sz w:val="28"/>
+          <w:szCs w:val="28"/>
+        </w:rPr>
+      </w:pPr>
+      <w:r>
+        <w:rPr>
+          <w:sz w:val="28"/>
+          <w:szCs w:val="28"/>
+        </w:rPr>
+        <w:t xml:space="preserve">As mentioned above, Django comes with a bunch of functionality built in, allowing developers </w:t>
+      </w:r>
+      <w:r>
+        <w:rPr>
+          <w:sz w:val="28"/>
+          <w:szCs w:val="28"/>
+        </w:rPr>
+        <w:t>to quickly get up and running. That is, developers can quickly focus on building their actual application after creating a new project.</w:t>
+      </w:r>
+    </w:p>
+    <w:p>
+      <w:pPr>
+        <w:pStyle w:val="ListParagraph"/>
+        <w:numPr>
+          <w:ilvl w:val="0"/>
+          <w:numId w:val="9"/>
+        </w:numPr>
+        <w:rPr>
+          <w:sz w:val="28"/>
+          <w:szCs w:val="28"/>
+        </w:rPr>
+      </w:pPr>
+      <w:r>
+        <w:rPr>
+          <w:sz w:val="28"/>
+          <w:szCs w:val="28"/>
+        </w:rPr>
+        <w:t xml:space="preserve">Django is built in and based in Python, giving developers access to the full extent of the Python world. This allows developers to more easily connect other Python libraries and functionality, such as </w:t>
+      </w:r>
+      <w:r>
+        <w:rPr>
+          <w:sz w:val="28"/>
+          <w:szCs w:val="28"/>
+        </w:rPr>
+        <w:t>data analysis and data science, or AI and machine learning, to their application.</w:t>
+      </w:r>
+    </w:p>
+    <w:p>
+      <w:pPr>
+        <w:pStyle w:val="ListParagraph"/>
+        <w:numPr>
+          <w:ilvl w:val="0"/>
+          <w:numId w:val="9"/>
+        </w:numPr>
+        <w:rPr>
+          <w:sz w:val="28"/>
+          <w:szCs w:val="28"/>
+        </w:rPr>
+      </w:pPr>
+      <w:r>
+        <w:rPr>
+          <w:sz w:val="28"/>
+          <w:szCs w:val="28"/>
+        </w:rPr>
+        <w:t>Django’s built-in templating system makes it easy to create dynamic content responses. Because of how Django handles inserting dynamci content into template responses, any form of data – from databases to the output of other Python libraries – can be easily added into any page or section of a web application.</w:t>
+      </w:r>
+    </w:p>
+    <w:p>
+      <w:pPr>
+        <w:pStyle w:val="ListParagraph"/>
+        <w:numPr>
+          <w:ilvl w:val="0"/>
+          <w:numId w:val="9"/>
+        </w:numPr>
+        <w:rPr>
+          <w:sz w:val="28"/>
+          <w:szCs w:val="28"/>
+        </w:rPr>
+      </w:pPr>
+      <w:r>
+        <w:rPr>
+          <w:sz w:val="28"/>
+          <w:szCs w:val="28"/>
+        </w:rPr>
+        <w:t xml:space="preserve">Django has a built-in client-side admin panel, which saves developers a lot of time and energy. Most modern websites and especially web applications allow for multiple users. Additionally, each user has site data that’s unique to them. As a result, site and application administrators will need a way to manage each user, both in terms of security – such as access and privacy – </w:t>
+      </w:r>
+      <w:r>
+        <w:rPr>
+          <w:sz w:val="28"/>
+          <w:szCs w:val="28"/>
+        </w:rPr>
+        <w:lastRenderedPageBreak/>
+        <w:t>and account details – such as authentication. With Django’s built-in client-side administration panel, developers don’t need to focus on creating that functionality, but can just turn it on and integrate it into their application.</w:t>
+      </w:r>
+    </w:p>
+    <w:p>
+      <w:pPr>
+        <w:rPr>
+          <w:sz w:val="28"/>
+          <w:szCs w:val="28"/>
+        </w:rPr>
+      </w:pPr>
+      <w:r>
+        <w:rPr>
+          <w:sz w:val="28"/>
+          <w:szCs w:val="28"/>
+        </w:rPr>
+        <w:t>Disadvantages:</w:t>
+      </w:r>
+    </w:p>
+    <w:p>
+      <w:pPr>
+        <w:pStyle w:val="ListParagraph"/>
+        <w:numPr>
+          <w:ilvl w:val="0"/>
+          <w:numId w:val="10"/>
+        </w:numPr>
+        <w:rPr>
+          <w:sz w:val="28"/>
+          <w:szCs w:val="28"/>
+        </w:rPr>
+      </w:pPr>
+      <w:r>
+        <w:rPr>
+          <w:sz w:val="28"/>
+          <w:szCs w:val="28"/>
+        </w:rPr>
+        <w:t>Django projects are more complicated to set up. Because Django provides so much built-in functionality, it isn’t a good choice for building simple sites or creating quick prototypes of a web application.</w:t>
+      </w:r>
+    </w:p>
+    <w:p>
+      <w:pPr>
+        <w:pStyle w:val="ListParagraph"/>
+        <w:numPr>
+          <w:ilvl w:val="0"/>
+          <w:numId w:val="10"/>
+        </w:numPr>
+        <w:rPr>
+          <w:sz w:val="28"/>
+          <w:szCs w:val="28"/>
+        </w:rPr>
+      </w:pPr>
+      <w:r>
+        <w:rPr>
+          <w:sz w:val="28"/>
+          <w:szCs w:val="28"/>
+        </w:rPr>
+        <w:t>Django is opinionated, meaning that it has a strict approach every developer has to take, especially when working with the built-in functionality. This can be a disadvantage if a developer wants to have more flexibility in their development approach.</w:t>
+      </w:r>
+    </w:p>
+    <w:p>
+      <w:pPr>
+        <w:pStyle w:val="ListParagraph"/>
+        <w:numPr>
+          <w:ilvl w:val="0"/>
+          <w:numId w:val="10"/>
+        </w:numPr>
+        <w:rPr>
+          <w:sz w:val="28"/>
+          <w:szCs w:val="28"/>
+        </w:rPr>
+      </w:pPr>
+      <w:r>
+        <w:rPr>
+          <w:sz w:val="28"/>
+          <w:szCs w:val="28"/>
+        </w:rPr>
+        <w:t>Django takes a lot of time to learn due to the extensive functionality and the strict approach to web development that is used. This can be challenging for developers who want to start using Django.</w:t>
+      </w:r>
+    </w:p>
+    <w:p>
+      <w:pPr>
+        <w:rPr>
+          <w:sz w:val="28"/>
+          <w:szCs w:val="28"/>
+        </w:rPr>
+      </w:pPr>
+    </w:p>
+    <w:p>
+      <w:pPr>
+        <w:rPr>
+          <w:b/>
+          <w:bCs/>
+          <w:sz w:val="28"/>
+          <w:szCs w:val="28"/>
+        </w:rPr>
+      </w:pPr>
+      <w:r>
+        <w:rPr>
+          <w:b/>
+          <w:bCs/>
+          <w:sz w:val="28"/>
+          <w:szCs w:val="28"/>
+        </w:rPr>
+        <w:t xml:space="preserve">5) </w:t>
       </w:r>
       <w:r>
         <w:rPr>
@@ -447,7 +623,6 @@
           <w:sz w:val="28"/>
           <w:szCs w:val="28"/>
         </w:rPr>
-        <w:lastRenderedPageBreak/>
         <w:t>Answer here.</w:t>
       </w:r>
     </w:p>
@@ -475,16 +650,7 @@
           <w:sz w:val="28"/>
           <w:szCs w:val="28"/>
         </w:rPr>
-        <w:t>6</w:t>
-      </w:r>
-      <w:r>
-        <w:rPr>
-          <w:b/>
-          <w:bCs/>
-          <w:sz w:val="28"/>
-          <w:szCs w:val="28"/>
-        </w:rPr>
-        <w:t xml:space="preserve">) </w:t>
+        <w:t xml:space="preserve">6) </w:t>
       </w:r>
       <w:r>
         <w:rPr>
@@ -537,53 +703,49 @@
     </w:p>
     <w:p>
       <w:pPr>
-        <w:rPr>
-          <w:sz w:val="28"/>
-          <w:szCs w:val="28"/>
-        </w:rPr>
-      </w:pPr>
-      <w:r>
-        <w:rPr>
-          <w:sz w:val="28"/>
-          <w:szCs w:val="28"/>
-        </w:rPr>
-        <w:t>Answer here.</w:t>
-      </w:r>
-    </w:p>
-    <w:p>
-      <w:pPr>
-        <w:rPr>
-          <w:sz w:val="28"/>
-          <w:szCs w:val="28"/>
-        </w:rPr>
-      </w:pPr>
-    </w:p>
-    <w:p>
-      <w:pPr>
-        <w:rPr>
-          <w:b/>
-          <w:bCs/>
-          <w:sz w:val="28"/>
-          <w:szCs w:val="28"/>
-        </w:rPr>
-      </w:pPr>
-      <w:r>
-        <w:rPr>
-          <w:b/>
-          <w:bCs/>
-          <w:sz w:val="28"/>
-          <w:szCs w:val="28"/>
-        </w:rPr>
-        <w:t>7</w:t>
-      </w:r>
-      <w:r>
-        <w:rPr>
-          <w:b/>
-          <w:bCs/>
-          <w:sz w:val="28"/>
-          <w:szCs w:val="28"/>
-        </w:rPr>
-        <w:t xml:space="preserve">) </w:t>
+        <w:pStyle w:val="ListParagraph"/>
+        <w:numPr>
+          <w:ilvl w:val="0"/>
+          <w:numId w:val="11"/>
+        </w:numPr>
+        <w:rPr>
+          <w:sz w:val="28"/>
+          <w:szCs w:val="28"/>
+        </w:rPr>
+      </w:pPr>
+      <w:r>
+        <w:rPr>
+          <w:sz w:val="28"/>
+          <w:szCs w:val="28"/>
+        </w:rPr>
+        <w:t>YouTube</w:t>
+      </w:r>
+    </w:p>
+    <w:p>
+      <w:pPr>
+        <w:rPr>
+          <w:sz w:val="28"/>
+          <w:szCs w:val="28"/>
+        </w:rPr>
+      </w:pPr>
+    </w:p>
+    <w:p>
+      <w:pPr>
+        <w:rPr>
+          <w:b/>
+          <w:bCs/>
+          <w:sz w:val="28"/>
+          <w:szCs w:val="28"/>
+        </w:rPr>
+      </w:pPr>
+      <w:r>
+        <w:rPr>
+          <w:b/>
+          <w:bCs/>
+          <w:sz w:val="28"/>
+          <w:szCs w:val="28"/>
+        </w:rPr>
+        <w:t xml:space="preserve">7) </w:t>
       </w:r>
       <w:r>
         <w:rPr>
@@ -611,6 +773,7 @@
           <w:sz w:val="28"/>
           <w:szCs w:val="28"/>
         </w:rPr>
+        <w:lastRenderedPageBreak/>
         <w:t>Research how Django applications scale and investigate examples of high-traffic websites that have used Django. Explain what additional technologies—such as caching, databases, load balancing, background workers, or APIs—may be required.</w:t>
       </w:r>
     </w:p>
@@ -653,16 +816,7 @@
           <w:sz w:val="28"/>
           <w:szCs w:val="28"/>
         </w:rPr>
-        <w:t>8</w:t>
-      </w:r>
-      <w:r>
-        <w:rPr>
-          <w:b/>
-          <w:bCs/>
-          <w:sz w:val="28"/>
-          <w:szCs w:val="28"/>
-        </w:rPr>
-        <w:t xml:space="preserve">) </w:t>
+        <w:t xml:space="preserve">8) </w:t>
       </w:r>
       <w:r>
         <w:rPr>
@@ -705,43 +859,55 @@
           <w:sz w:val="28"/>
           <w:szCs w:val="28"/>
         </w:rPr>
-        <w:t>Answer here.</w:t>
-      </w:r>
-    </w:p>
-    <w:p>
-      <w:pPr>
-        <w:rPr>
-          <w:sz w:val="28"/>
-          <w:szCs w:val="28"/>
-        </w:rPr>
-      </w:pPr>
-    </w:p>
-    <w:p>
-      <w:pPr>
-        <w:rPr>
-          <w:b/>
-          <w:bCs/>
-          <w:sz w:val="28"/>
-          <w:szCs w:val="28"/>
-        </w:rPr>
-      </w:pPr>
-      <w:r>
-        <w:rPr>
-          <w:b/>
-          <w:bCs/>
-          <w:sz w:val="28"/>
-          <w:szCs w:val="28"/>
-        </w:rPr>
-        <w:t>9</w:t>
-      </w:r>
-      <w:r>
-        <w:rPr>
-          <w:b/>
-          <w:bCs/>
-          <w:sz w:val="28"/>
-          <w:szCs w:val="28"/>
-        </w:rPr>
-        <w:t xml:space="preserve">) </w:t>
+        <w:t xml:space="preserve">Django’s ORM approach allows developers to use OOP concepts – such as classes, inheritance, polymorphism, etc. </w:t>
+      </w:r>
+      <w:r>
+        <w:rPr>
+          <w:sz w:val="28"/>
+          <w:szCs w:val="28"/>
+        </w:rPr>
+        <w:t>–</w:t>
+      </w:r>
+      <w:r>
+        <w:rPr>
+          <w:sz w:val="28"/>
+          <w:szCs w:val="28"/>
+        </w:rPr>
+        <w:t xml:space="preserve"> </w:t>
+      </w:r>
+      <w:r>
+        <w:rPr>
+          <w:sz w:val="28"/>
+          <w:szCs w:val="28"/>
+        </w:rPr>
+        <w:t>to model and work with data in a database. Since Django works well with relational databases, an application’s data is already structured and connected. Through the ORM approach, the same structure and connections can be easily replicated using Django Models. This makes it much easier for an application to create, modify, and delete data – whether through the internal application logic, the use of an outside Python library that also works with data, or the user interaction on the front-end via the built-in admin interface.</w:t>
+      </w:r>
+    </w:p>
+    <w:p>
+      <w:pPr>
+        <w:rPr>
+          <w:sz w:val="28"/>
+          <w:szCs w:val="28"/>
+        </w:rPr>
+      </w:pPr>
+    </w:p>
+    <w:p>
+      <w:pPr>
+        <w:rPr>
+          <w:b/>
+          <w:bCs/>
+          <w:sz w:val="28"/>
+          <w:szCs w:val="28"/>
+        </w:rPr>
+      </w:pPr>
+      <w:r>
+        <w:rPr>
+          <w:b/>
+          <w:bCs/>
+          <w:sz w:val="28"/>
+          <w:szCs w:val="28"/>
+        </w:rPr>
+        <w:t xml:space="preserve">9) </w:t>
       </w:r>
       <w:r>
         <w:rPr>
@@ -831,17 +997,7 @@
           <w:sz w:val="28"/>
           <w:szCs w:val="28"/>
         </w:rPr>
-        <w:lastRenderedPageBreak/>
-        <w:t>10</w:t>
-      </w:r>
-      <w:r>
-        <w:rPr>
-          <w:b/>
-          <w:bCs/>
-          <w:sz w:val="28"/>
-          <w:szCs w:val="28"/>
-        </w:rPr>
-        <w:t xml:space="preserve">) </w:t>
+        <w:t xml:space="preserve">10) </w:t>
       </w:r>
       <w:r>
         <w:rPr>
@@ -895,6 +1051,7 @@
           <w:sz w:val="28"/>
           <w:szCs w:val="28"/>
         </w:rPr>
+        <w:lastRenderedPageBreak/>
         <w:t>Answer here.</w:t>
       </w:r>
     </w:p>
@@ -909,7 +1066,7 @@
 </file>
 
 <file path=word/numbering.xml><?xml version="1.0" encoding="utf-8"?>
-<w:numbering xmlns:wpc="http://schemas.microsoft.com/office/word/2010/wordprocessingCanvas" xmlns:cx="http://schemas.microsoft.com/office/drawing/2014/chartex" xmlns:cx1="http://schemas.microsoft.com/office/drawing/2015/9/8/chartex" xmlns:cx2="http://schemas.microsoft.com/office/drawing/2015/10/21/chartex" xmlns:cx3="http://schemas.microsoft.com/office/drawing/2016/5/9/chartex" xmlns:cx4="http://schemas.microsoft.com/office/drawing/2016/5/10/chartex" xmlns:cx5="http://schemas.microsoft.com/office/drawing/2016/5/11/chartex" xmlns:cx6="http://schemas.microsoft.com/office/drawing/2016/5/12/chartex" xmlns:cx7="http://schemas.microsoft.com/office/drawing/2016/5/13/chartex" xmlns:cx8="http://schemas.microsoft.com/office/drawing/2016/5/14/chartex" xmlns:mc="http://schemas.openxmlformats.org/markup-compatibility/2006" xmlns:aink="http://schemas.microsoft.com/office/drawing/2016/ink" xmlns:am3d="http://schemas.microsoft.com/office/drawing/2017/model3d" xmlns:o="urn:schemas-microsoft-com:office:office" xmlns:oel="http://schemas.microsoft.com/office/2019/extlst" xmlns:r="http://schemas.openxmlformats.org/officeDocument/2006/relationships" xmlns:m="http://schemas.openxmlformats.org/officeDocument/2006/math" xmlns:v="urn:schemas-microsoft-com:vml" xmlns:wp14="http://schemas.microsoft.com/office/word/2010/wordprocessingDrawing" xmlns:wp="http://schemas.openxmlformats.org/drawingml/2006/wordprocessingDrawing" xmlns:w10="urn:schemas-microsoft-com:office:word" xmlns:w="http://schemas.openxmlformats.org/wordprocessingml/2006/main" xmlns:w14="http://schemas.microsoft.com/office/word/2010/wordml" xmlns:w15="http://schemas.microsoft.com/office/word/2012/wordml" xmlns:w16cei="http://schemas.microsoft.com/office/word/2026/wordml/cei" xmlns:w16cex="http://schemas.microsoft.com/office/word/2018/wordml/cex" xmlns:w16cid="http://schemas.microsoft.com/office/word/2016/wordml/cid" xmlns:w16="http://schemas.microsoft.com/office/word/2018/wordml" xmlns:w16du="http://schemas.microsoft.com/office/word/2023/wordml/word16du" xmlns:w16sdtdh="http://schemas.microsoft.com/office/word/2020/wordml/sdtdatahash" xmlns:w16sdtfl="http://schemas.microsoft.com/office/word/2024/wordml/sdtformatlock" xmlns:w16se="http://schemas.microsoft.com/office/word/2015/wordml/symex" xmlns:wpg="http://schemas.microsoft.com/office/word/2010/wordprocessingGroup" xmlns:wpi="http://schemas.microsoft.com/office/word/2010/wordprocessingInk" xmlns:wne="http://schemas.microsoft.com/office/word/2006/wordml" xmlns:wps="http://schemas.microsoft.com/office/word/2010/wordprocessingShape" mc:Ignorable="w14 w15 w16se w16cid w16 w16cex w16sdtdh w16sdtfl w16du wp14">
+<w:numbering xmlns:wpc="http://schemas.microsoft.com/office/word/2010/wordprocessingCanvas" xmlns:cx="http://schemas.microsoft.com/office/drawing/2014/chartex" xmlns:cx1="http://schemas.microsoft.com/office/drawing/2015/9/8/chartex" xmlns:cx2="http://schemas.microsoft.com/office/drawing/2015/10/21/chartex" xmlns:cx3="http://schemas.microsoft.com/office/drawing/2016/5/9/chartex" xmlns:cx4="http://schemas.microsoft.com/office/drawing/2016/5/10/chartex" xmlns:cx5="http://schemas.microsoft.com/office/drawing/2016/5/11/chartex" xmlns:cx6="http://schemas.microsoft.com/office/drawing/2016/5/12/chartex" xmlns:cx7="http://schemas.microsoft.com/office/drawing/2016/5/13/chartex" xmlns:cx8="http://schemas.microsoft.com/office/drawing/2016/5/14/chartex" xmlns:mc="http://schemas.openxmlformats.org/markup-compatibility/2006" xmlns:aink="http://schemas.microsoft.com/office/drawing/2016/ink" xmlns:am3d="http://schemas.microsoft.com/office/drawing/2017/model3d" xmlns:o="urn:schemas-microsoft-com:office:office" xmlns:oel="http://schemas.microsoft.com/office/2019/extlst" xmlns:r="http://schemas.openxmlformats.org/officeDocument/2006/relationships" xmlns:m="http://schemas.openxmlformats.org/officeDocument/2006/math" xmlns:v="urn:schemas-microsoft-com:vml" xmlns:wp14="http://schemas.microsoft.com/office/word/2010/wordprocessingDrawing" xmlns:wp="http://schemas.openxmlformats.org/drawingml/2006/wordprocessingDrawing" xmlns:w10="urn:schemas-microsoft-com:office:word" xmlns:w="http://schemas.openxmlformats.org/wordprocessingml/2006/main" xmlns:w14="http://schemas.microsoft.com/office/word/2010/wordml" xmlns:w15="http://schemas.microsoft.com/office/word/2012/wordml" xmlns:w16cex="http://schemas.microsoft.com/office/word/2018/wordml/cex" xmlns:w16cid="http://schemas.microsoft.com/office/word/2016/wordml/cid" xmlns:w16="http://schemas.microsoft.com/office/word/2018/wordml" xmlns:w16du="http://schemas.microsoft.com/office/word/2023/wordml/word16du" xmlns:w16sdtdh="http://schemas.microsoft.com/office/word/2020/wordml/sdtdatahash" xmlns:w16sdtfl="http://schemas.microsoft.com/office/word/2024/wordml/sdtformatlock" xmlns:w16se="http://schemas.microsoft.com/office/word/2015/wordml/symex" xmlns:wpg="http://schemas.microsoft.com/office/word/2010/wordprocessingGroup" xmlns:wpi="http://schemas.microsoft.com/office/word/2010/wordprocessingInk" xmlns:wne="http://schemas.microsoft.com/office/word/2006/wordml" xmlns:wps="http://schemas.microsoft.com/office/word/2010/wordprocessingShape" mc:Ignorable="w14 w15 w16se w16cid w16 w16cex w16sdtdh w16sdtfl w16du wp14">
   <w:abstractNum w:abstractNumId="0" w15:restartNumberingAfterBreak="0">
     <w:nsid w:val="036328FA"/>
     <w:multiLevelType w:val="hybridMultilevel"/>
@@ -1198,6 +1355,95 @@
     </w:lvl>
   </w:abstractNum>
   <w:abstractNum w:abstractNumId="3" w15:restartNumberingAfterBreak="0">
+    <w:nsid w:val="35DE324D"/>
+    <w:multiLevelType w:val="hybridMultilevel"/>
+    <w:tmpl w:val="226E48A0"/>
+    <w:lvl w:ilvl="0" w:tplc="10090019">
+      <w:start w:val="1"/>
+      <w:numFmt w:val="lowerLetter"/>
+      <w:lvlText w:val="%1."/>
+      <w:lvlJc w:val="left"/>
+      <w:pPr>
+        <w:ind w:left="720" w:hanging="360"/>
+      </w:pPr>
+      <w:rPr>
+        <w:rFonts w:hint="default"/>
+      </w:rPr>
+    </w:lvl>
+    <w:lvl w:ilvl="1" w:tplc="10090019" w:tentative="1">
+      <w:start w:val="1"/>
+      <w:numFmt w:val="lowerLetter"/>
+      <w:lvlText w:val="%2."/>
+      <w:lvlJc w:val="left"/>
+      <w:pPr>
+        <w:ind w:left="1440" w:hanging="360"/>
+      </w:pPr>
+    </w:lvl>
+    <w:lvl w:ilvl="2" w:tplc="1009001B" w:tentative="1">
+      <w:start w:val="1"/>
+      <w:numFmt w:val="lowerRoman"/>
+      <w:lvlText w:val="%3."/>
+      <w:lvlJc w:val="right"/>
+      <w:pPr>
+        <w:ind w:left="2160" w:hanging="180"/>
+      </w:pPr>
+    </w:lvl>
+    <w:lvl w:ilvl="3" w:tplc="1009000F" w:tentative="1">
+      <w:start w:val="1"/>
+      <w:numFmt w:val="decimal"/>
+      <w:lvlText w:val="%4."/>
+      <w:lvlJc w:val="left"/>
+      <w:pPr>
+        <w:ind w:left="2880" w:hanging="360"/>
+      </w:pPr>
+    </w:lvl>
+    <w:lvl w:ilvl="4" w:tplc="10090019" w:tentative="1">
+      <w:start w:val="1"/>
+      <w:numFmt w:val="lowerLetter"/>
+      <w:lvlText w:val="%5."/>
+      <w:lvlJc w:val="left"/>
+      <w:pPr>
+        <w:ind w:left="3600" w:hanging="360"/>
+      </w:pPr>
+    </w:lvl>
+    <w:lvl w:ilvl="5" w:tplc="1009001B" w:tentative="1">
+      <w:start w:val="1"/>
+      <w:numFmt w:val="lowerRoman"/>
+      <w:lvlText w:val="%6."/>
+      <w:lvlJc w:val="right"/>
+      <w:pPr>
+        <w:ind w:left="4320" w:hanging="180"/>
+      </w:pPr>
+    </w:lvl>
+    <w:lvl w:ilvl="6" w:tplc="1009000F" w:tentative="1">
+      <w:start w:val="1"/>
+      <w:numFmt w:val="decimal"/>
+      <w:lvlText w:val="%7."/>
+      <w:lvlJc w:val="left"/>
+      <w:pPr>
+        <w:ind w:left="5040" w:hanging="360"/>
+      </w:pPr>
+    </w:lvl>
+    <w:lvl w:ilvl="7" w:tplc="10090019" w:tentative="1">
+      <w:start w:val="1"/>
+      <w:numFmt w:val="lowerLetter"/>
+      <w:lvlText w:val="%8."/>
+      <w:lvlJc w:val="left"/>
+      <w:pPr>
+        <w:ind w:left="5760" w:hanging="360"/>
+      </w:pPr>
+    </w:lvl>
+    <w:lvl w:ilvl="8" w:tplc="1009001B" w:tentative="1">
+      <w:start w:val="1"/>
+      <w:numFmt w:val="lowerRoman"/>
+      <w:lvlText w:val="%9."/>
+      <w:lvlJc w:val="right"/>
+      <w:pPr>
+        <w:ind w:left="6480" w:hanging="180"/>
+      </w:pPr>
+    </w:lvl>
+  </w:abstractNum>
+  <w:abstractNum w:abstractNumId="4" w15:restartNumberingAfterBreak="0">
     <w:nsid w:val="3936021B"/>
     <w:multiLevelType w:val="hybridMultilevel"/>
     <w:tmpl w:val="043CDAD4"/>
@@ -1286,7 +1532,363 @@
       </w:pPr>
     </w:lvl>
   </w:abstractNum>
-  <w:abstractNum w:abstractNumId="4" w15:restartNumberingAfterBreak="0">
+  <w:abstractNum w:abstractNumId="5" w15:restartNumberingAfterBreak="0">
+    <w:nsid w:val="3FB0007E"/>
+    <w:multiLevelType w:val="hybridMultilevel"/>
+    <w:tmpl w:val="9EF46354"/>
+    <w:lvl w:ilvl="0" w:tplc="10090015">
+      <w:start w:val="1"/>
+      <w:numFmt w:val="upperLetter"/>
+      <w:lvlText w:val="%1."/>
+      <w:lvlJc w:val="left"/>
+      <w:pPr>
+        <w:ind w:left="720" w:hanging="360"/>
+      </w:pPr>
+      <w:rPr>
+        <w:rFonts w:hint="default"/>
+      </w:rPr>
+    </w:lvl>
+    <w:lvl w:ilvl="1" w:tplc="10090019" w:tentative="1">
+      <w:start w:val="1"/>
+      <w:numFmt w:val="lowerLetter"/>
+      <w:lvlText w:val="%2."/>
+      <w:lvlJc w:val="left"/>
+      <w:pPr>
+        <w:ind w:left="1440" w:hanging="360"/>
+      </w:pPr>
+    </w:lvl>
+    <w:lvl w:ilvl="2" w:tplc="1009001B" w:tentative="1">
+      <w:start w:val="1"/>
+      <w:numFmt w:val="lowerRoman"/>
+      <w:lvlText w:val="%3."/>
+      <w:lvlJc w:val="right"/>
+      <w:pPr>
+        <w:ind w:left="2160" w:hanging="180"/>
+      </w:pPr>
+    </w:lvl>
+    <w:lvl w:ilvl="3" w:tplc="1009000F" w:tentative="1">
+      <w:start w:val="1"/>
+      <w:numFmt w:val="decimal"/>
+      <w:lvlText w:val="%4."/>
+      <w:lvlJc w:val="left"/>
+      <w:pPr>
+        <w:ind w:left="2880" w:hanging="360"/>
+      </w:pPr>
+    </w:lvl>
+    <w:lvl w:ilvl="4" w:tplc="10090019" w:tentative="1">
+      <w:start w:val="1"/>
+      <w:numFmt w:val="lowerLetter"/>
+      <w:lvlText w:val="%5."/>
+      <w:lvlJc w:val="left"/>
+      <w:pPr>
+        <w:ind w:left="3600" w:hanging="360"/>
+      </w:pPr>
+    </w:lvl>
+    <w:lvl w:ilvl="5" w:tplc="1009001B" w:tentative="1">
+      <w:start w:val="1"/>
+      <w:numFmt w:val="lowerRoman"/>
+      <w:lvlText w:val="%6."/>
+      <w:lvlJc w:val="right"/>
+      <w:pPr>
+        <w:ind w:left="4320" w:hanging="180"/>
+      </w:pPr>
+    </w:lvl>
+    <w:lvl w:ilvl="6" w:tplc="1009000F" w:tentative="1">
+      <w:start w:val="1"/>
+      <w:numFmt w:val="decimal"/>
+      <w:lvlText w:val="%7."/>
+      <w:lvlJc w:val="left"/>
+      <w:pPr>
+        <w:ind w:left="5040" w:hanging="360"/>
+      </w:pPr>
+    </w:lvl>
+    <w:lvl w:ilvl="7" w:tplc="10090019" w:tentative="1">
+      <w:start w:val="1"/>
+      <w:numFmt w:val="lowerLetter"/>
+      <w:lvlText w:val="%8."/>
+      <w:lvlJc w:val="left"/>
+      <w:pPr>
+        <w:ind w:left="5760" w:hanging="360"/>
+      </w:pPr>
+    </w:lvl>
+    <w:lvl w:ilvl="8" w:tplc="1009001B" w:tentative="1">
+      <w:start w:val="1"/>
+      <w:numFmt w:val="lowerRoman"/>
+      <w:lvlText w:val="%9."/>
+      <w:lvlJc w:val="right"/>
+      <w:pPr>
+        <w:ind w:left="6480" w:hanging="180"/>
+      </w:pPr>
+    </w:lvl>
+  </w:abstractNum>
+  <w:abstractNum w:abstractNumId="6" w15:restartNumberingAfterBreak="0">
+    <w:nsid w:val="619B3246"/>
+    <w:multiLevelType w:val="hybridMultilevel"/>
+    <w:tmpl w:val="DA56CAB8"/>
+    <w:lvl w:ilvl="0" w:tplc="10090019">
+      <w:start w:val="1"/>
+      <w:numFmt w:val="lowerLetter"/>
+      <w:lvlText w:val="%1."/>
+      <w:lvlJc w:val="left"/>
+      <w:pPr>
+        <w:ind w:left="720" w:hanging="360"/>
+      </w:pPr>
+      <w:rPr>
+        <w:rFonts w:hint="default"/>
+      </w:rPr>
+    </w:lvl>
+    <w:lvl w:ilvl="1" w:tplc="10090019" w:tentative="1">
+      <w:start w:val="1"/>
+      <w:numFmt w:val="lowerLetter"/>
+      <w:lvlText w:val="%2."/>
+      <w:lvlJc w:val="left"/>
+      <w:pPr>
+        <w:ind w:left="1440" w:hanging="360"/>
+      </w:pPr>
+    </w:lvl>
+    <w:lvl w:ilvl="2" w:tplc="1009001B" w:tentative="1">
+      <w:start w:val="1"/>
+      <w:numFmt w:val="lowerRoman"/>
+      <w:lvlText w:val="%3."/>
+      <w:lvlJc w:val="right"/>
+      <w:pPr>
+        <w:ind w:left="2160" w:hanging="180"/>
+      </w:pPr>
+    </w:lvl>
+    <w:lvl w:ilvl="3" w:tplc="1009000F" w:tentative="1">
+      <w:start w:val="1"/>
+      <w:numFmt w:val="decimal"/>
+      <w:lvlText w:val="%4."/>
+      <w:lvlJc w:val="left"/>
+      <w:pPr>
+        <w:ind w:left="2880" w:hanging="360"/>
+      </w:pPr>
+    </w:lvl>
+    <w:lvl w:ilvl="4" w:tplc="10090019" w:tentative="1">
+      <w:start w:val="1"/>
+      <w:numFmt w:val="lowerLetter"/>
+      <w:lvlText w:val="%5."/>
+      <w:lvlJc w:val="left"/>
+      <w:pPr>
+        <w:ind w:left="3600" w:hanging="360"/>
+      </w:pPr>
+    </w:lvl>
+    <w:lvl w:ilvl="5" w:tplc="1009001B" w:tentative="1">
+      <w:start w:val="1"/>
+      <w:numFmt w:val="lowerRoman"/>
+      <w:lvlText w:val="%6."/>
+      <w:lvlJc w:val="right"/>
+      <w:pPr>
+        <w:ind w:left="4320" w:hanging="180"/>
+      </w:pPr>
+    </w:lvl>
+    <w:lvl w:ilvl="6" w:tplc="1009000F" w:tentative="1">
+      <w:start w:val="1"/>
+      <w:numFmt w:val="decimal"/>
+      <w:lvlText w:val="%7."/>
+      <w:lvlJc w:val="left"/>
+      <w:pPr>
+        <w:ind w:left="5040" w:hanging="360"/>
+      </w:pPr>
+    </w:lvl>
+    <w:lvl w:ilvl="7" w:tplc="10090019" w:tentative="1">
+      <w:start w:val="1"/>
+      <w:numFmt w:val="lowerLetter"/>
+      <w:lvlText w:val="%8."/>
+      <w:lvlJc w:val="left"/>
+      <w:pPr>
+        <w:ind w:left="5760" w:hanging="360"/>
+      </w:pPr>
+    </w:lvl>
+    <w:lvl w:ilvl="8" w:tplc="1009001B" w:tentative="1">
+      <w:start w:val="1"/>
+      <w:numFmt w:val="lowerRoman"/>
+      <w:lvlText w:val="%9."/>
+      <w:lvlJc w:val="right"/>
+      <w:pPr>
+        <w:ind w:left="6480" w:hanging="180"/>
+      </w:pPr>
+    </w:lvl>
+  </w:abstractNum>
+  <w:abstractNum w:abstractNumId="7" w15:restartNumberingAfterBreak="0">
+    <w:nsid w:val="65204C84"/>
+    <w:multiLevelType w:val="hybridMultilevel"/>
+    <w:tmpl w:val="71AA14FA"/>
+    <w:lvl w:ilvl="0" w:tplc="10090019">
+      <w:start w:val="1"/>
+      <w:numFmt w:val="lowerLetter"/>
+      <w:lvlText w:val="%1."/>
+      <w:lvlJc w:val="left"/>
+      <w:pPr>
+        <w:ind w:left="720" w:hanging="360"/>
+      </w:pPr>
+      <w:rPr>
+        <w:rFonts w:hint="default"/>
+      </w:rPr>
+    </w:lvl>
+    <w:lvl w:ilvl="1" w:tplc="10090019" w:tentative="1">
+      <w:start w:val="1"/>
+      <w:numFmt w:val="lowerLetter"/>
+      <w:lvlText w:val="%2."/>
+      <w:lvlJc w:val="left"/>
+      <w:pPr>
+        <w:ind w:left="1440" w:hanging="360"/>
+      </w:pPr>
+    </w:lvl>
+    <w:lvl w:ilvl="2" w:tplc="1009001B" w:tentative="1">
+      <w:start w:val="1"/>
+      <w:numFmt w:val="lowerRoman"/>
+      <w:lvlText w:val="%3."/>
+      <w:lvlJc w:val="right"/>
+      <w:pPr>
+        <w:ind w:left="2160" w:hanging="180"/>
+      </w:pPr>
+    </w:lvl>
+    <w:lvl w:ilvl="3" w:tplc="1009000F" w:tentative="1">
+      <w:start w:val="1"/>
+      <w:numFmt w:val="decimal"/>
+      <w:lvlText w:val="%4."/>
+      <w:lvlJc w:val="left"/>
+      <w:pPr>
+        <w:ind w:left="2880" w:hanging="360"/>
+      </w:pPr>
+    </w:lvl>
+    <w:lvl w:ilvl="4" w:tplc="10090019" w:tentative="1">
+      <w:start w:val="1"/>
+      <w:numFmt w:val="lowerLetter"/>
+      <w:lvlText w:val="%5."/>
+      <w:lvlJc w:val="left"/>
+      <w:pPr>
+        <w:ind w:left="3600" w:hanging="360"/>
+      </w:pPr>
+    </w:lvl>
+    <w:lvl w:ilvl="5" w:tplc="1009001B" w:tentative="1">
+      <w:start w:val="1"/>
+      <w:numFmt w:val="lowerRoman"/>
+      <w:lvlText w:val="%6."/>
+      <w:lvlJc w:val="right"/>
+      <w:pPr>
+        <w:ind w:left="4320" w:hanging="180"/>
+      </w:pPr>
+    </w:lvl>
+    <w:lvl w:ilvl="6" w:tplc="1009000F" w:tentative="1">
+      <w:start w:val="1"/>
+      <w:numFmt w:val="decimal"/>
+      <w:lvlText w:val="%7."/>
+      <w:lvlJc w:val="left"/>
+      <w:pPr>
+        <w:ind w:left="5040" w:hanging="360"/>
+      </w:pPr>
+    </w:lvl>
+    <w:lvl w:ilvl="7" w:tplc="10090019" w:tentative="1">
+      <w:start w:val="1"/>
+      <w:numFmt w:val="lowerLetter"/>
+      <w:lvlText w:val="%8."/>
+      <w:lvlJc w:val="left"/>
+      <w:pPr>
+        <w:ind w:left="5760" w:hanging="360"/>
+      </w:pPr>
+    </w:lvl>
+    <w:lvl w:ilvl="8" w:tplc="1009001B" w:tentative="1">
+      <w:start w:val="1"/>
+      <w:numFmt w:val="lowerRoman"/>
+      <w:lvlText w:val="%9."/>
+      <w:lvlJc w:val="right"/>
+      <w:pPr>
+        <w:ind w:left="6480" w:hanging="180"/>
+      </w:pPr>
+    </w:lvl>
+  </w:abstractNum>
+  <w:abstractNum w:abstractNumId="8" w15:restartNumberingAfterBreak="0">
+    <w:nsid w:val="70261EF9"/>
+    <w:multiLevelType w:val="hybridMultilevel"/>
+    <w:tmpl w:val="A7F60F9A"/>
+    <w:lvl w:ilvl="0" w:tplc="1009000F">
+      <w:start w:val="1"/>
+      <w:numFmt w:val="decimal"/>
+      <w:lvlText w:val="%1."/>
+      <w:lvlJc w:val="left"/>
+      <w:pPr>
+        <w:ind w:left="720" w:hanging="360"/>
+      </w:pPr>
+      <w:rPr>
+        <w:rFonts w:hint="default"/>
+      </w:rPr>
+    </w:lvl>
+    <w:lvl w:ilvl="1" w:tplc="10090019" w:tentative="1">
+      <w:start w:val="1"/>
+      <w:numFmt w:val="lowerLetter"/>
+      <w:lvlText w:val="%2."/>
+      <w:lvlJc w:val="left"/>
+      <w:pPr>
+        <w:ind w:left="1440" w:hanging="360"/>
+      </w:pPr>
+    </w:lvl>
+    <w:lvl w:ilvl="2" w:tplc="1009001B" w:tentative="1">
+      <w:start w:val="1"/>
+      <w:numFmt w:val="lowerRoman"/>
+      <w:lvlText w:val="%3."/>
+      <w:lvlJc w:val="right"/>
+      <w:pPr>
+        <w:ind w:left="2160" w:hanging="180"/>
+      </w:pPr>
+    </w:lvl>
+    <w:lvl w:ilvl="3" w:tplc="1009000F" w:tentative="1">
+      <w:start w:val="1"/>
+      <w:numFmt w:val="decimal"/>
+      <w:lvlText w:val="%4."/>
+      <w:lvlJc w:val="left"/>
+      <w:pPr>
+        <w:ind w:left="2880" w:hanging="360"/>
+      </w:pPr>
+    </w:lvl>
+    <w:lvl w:ilvl="4" w:tplc="10090019" w:tentative="1">
+      <w:start w:val="1"/>
+      <w:numFmt w:val="lowerLetter"/>
+      <w:lvlText w:val="%5."/>
+      <w:lvlJc w:val="left"/>
+      <w:pPr>
+        <w:ind w:left="3600" w:hanging="360"/>
+      </w:pPr>
+    </w:lvl>
+    <w:lvl w:ilvl="5" w:tplc="1009001B" w:tentative="1">
+      <w:start w:val="1"/>
+      <w:numFmt w:val="lowerRoman"/>
+      <w:lvlText w:val="%6."/>
+      <w:lvlJc w:val="right"/>
+      <w:pPr>
+        <w:ind w:left="4320" w:hanging="180"/>
+      </w:pPr>
+    </w:lvl>
+    <w:lvl w:ilvl="6" w:tplc="1009000F" w:tentative="1">
+      <w:start w:val="1"/>
+      <w:numFmt w:val="decimal"/>
+      <w:lvlText w:val="%7."/>
+      <w:lvlJc w:val="left"/>
+      <w:pPr>
+        <w:ind w:left="5040" w:hanging="360"/>
+      </w:pPr>
+    </w:lvl>
+    <w:lvl w:ilvl="7" w:tplc="10090019" w:tentative="1">
+      <w:start w:val="1"/>
+      <w:numFmt w:val="lowerLetter"/>
+      <w:lvlText w:val="%8."/>
+      <w:lvlJc w:val="left"/>
+      <w:pPr>
+        <w:ind w:left="5760" w:hanging="360"/>
+      </w:pPr>
+    </w:lvl>
+    <w:lvl w:ilvl="8" w:tplc="1009001B" w:tentative="1">
+      <w:start w:val="1"/>
+      <w:numFmt w:val="lowerRoman"/>
+      <w:lvlText w:val="%9."/>
+      <w:lvlJc w:val="right"/>
+      <w:pPr>
+        <w:ind w:left="6480" w:hanging="180"/>
+      </w:pPr>
+    </w:lvl>
+  </w:abstractNum>
+  <w:abstractNum w:abstractNumId="9" w15:restartNumberingAfterBreak="0">
     <w:nsid w:val="7A9B6FB8"/>
     <w:multiLevelType w:val="hybridMultilevel"/>
     <w:tmpl w:val="51A464C8"/>
@@ -1375,7 +1977,7 @@
       </w:pPr>
     </w:lvl>
   </w:abstractNum>
-  <w:abstractNum w:abstractNumId="5" w15:restartNumberingAfterBreak="0">
+  <w:abstractNum w:abstractNumId="10" w15:restartNumberingAfterBreak="0">
     <w:nsid w:val="7F610334"/>
     <w:multiLevelType w:val="hybridMultilevel"/>
     <w:tmpl w:val="3E6E5ECC"/>
@@ -1465,22 +2067,37 @@
     </w:lvl>
   </w:abstractNum>
   <w:num w:numId="1" w16cid:durableId="1837113513">
-    <w:abstractNumId w:val="4"/>
+    <w:abstractNumId w:val="9"/>
   </w:num>
   <w:num w:numId="2" w16cid:durableId="725224361">
     <w:abstractNumId w:val="0"/>
   </w:num>
   <w:num w:numId="3" w16cid:durableId="704602765">
-    <w:abstractNumId w:val="5"/>
+    <w:abstractNumId w:val="10"/>
   </w:num>
   <w:num w:numId="4" w16cid:durableId="1484738448">
-    <w:abstractNumId w:val="3"/>
+    <w:abstractNumId w:val="4"/>
   </w:num>
   <w:num w:numId="5" w16cid:durableId="1721201291">
     <w:abstractNumId w:val="2"/>
   </w:num>
   <w:num w:numId="6" w16cid:durableId="329722513">
     <w:abstractNumId w:val="1"/>
+  </w:num>
+  <w:num w:numId="7" w16cid:durableId="1803769546">
+    <w:abstractNumId w:val="8"/>
+  </w:num>
+  <w:num w:numId="8" w16cid:durableId="1174106815">
+    <w:abstractNumId w:val="5"/>
+  </w:num>
+  <w:num w:numId="9" w16cid:durableId="830557741">
+    <w:abstractNumId w:val="6"/>
+  </w:num>
+  <w:num w:numId="10" w16cid:durableId="1942106118">
+    <w:abstractNumId w:val="3"/>
+  </w:num>
+  <w:num w:numId="11" w16cid:durableId="1787961844">
+    <w:abstractNumId w:val="7"/>
   </w:num>
 </w:numbering>
 </file>
@@ -2089,6 +2706,7 @@
   <w:style w:type="character" w:default="1" w:styleId="DefaultParagraphFont">
     <w:name w:val="Default Paragraph Font"/>
     <w:uiPriority w:val="1"/>
+    <w:semiHidden/>
     <w:unhideWhenUsed/>
   </w:style>
   <w:style w:type="table" w:default="1" w:styleId="TableNormal">

</xml_diff>

<commit_message>
Answered questions 9 and 10
</commit_message>
<xml_diff>
--- a/local/canadian-business-college/full-stack-web-application/assignment-project-content/Module9_Django/assignments/1/Django Assigment One - David Watson.docx
+++ b/local/canadian-business-college/full-stack-web-application/assignment-project-content/Module9_Django/assignments/1/Django Assigment One - David Watson.docx
@@ -1107,7 +1107,506 @@
           <w:sz w:val="28"/>
           <w:szCs w:val="28"/>
         </w:rPr>
-        <w:t>Answer here.</w:t>
+        <w:t>Django:</w:t>
+      </w:r>
+    </w:p>
+    <w:p>
+      <w:pPr>
+        <w:pStyle w:val="ListParagraph"/>
+        <w:numPr>
+          <w:ilvl w:val="0"/>
+          <w:numId w:val="12"/>
+        </w:numPr>
+        <w:rPr>
+          <w:sz w:val="28"/>
+          <w:szCs w:val="28"/>
+        </w:rPr>
+      </w:pPr>
+      <w:r>
+        <w:rPr>
+          <w:sz w:val="28"/>
+          <w:szCs w:val="28"/>
+        </w:rPr>
+        <w:t>Development speed – Possibly the fastest due to the many built-in functionality that comes with Django. This leads to less time setting up the lower layers of an application.</w:t>
+      </w:r>
+    </w:p>
+    <w:p>
+      <w:pPr>
+        <w:pStyle w:val="ListParagraph"/>
+        <w:numPr>
+          <w:ilvl w:val="0"/>
+          <w:numId w:val="12"/>
+        </w:numPr>
+        <w:rPr>
+          <w:sz w:val="28"/>
+          <w:szCs w:val="28"/>
+        </w:rPr>
+      </w:pPr>
+      <w:r>
+        <w:rPr>
+          <w:sz w:val="28"/>
+          <w:szCs w:val="28"/>
+        </w:rPr>
+        <w:t>Scalability – The ability to use multiple instances of a Django server means that Django scales well horizontally. However, a Django instance uses a lot of memory.</w:t>
+      </w:r>
+    </w:p>
+    <w:p>
+      <w:pPr>
+        <w:pStyle w:val="ListParagraph"/>
+        <w:numPr>
+          <w:ilvl w:val="0"/>
+          <w:numId w:val="12"/>
+        </w:numPr>
+        <w:rPr>
+          <w:sz w:val="28"/>
+          <w:szCs w:val="28"/>
+        </w:rPr>
+      </w:pPr>
+      <w:r>
+        <w:rPr>
+          <w:sz w:val="28"/>
+          <w:szCs w:val="28"/>
+        </w:rPr>
+        <w:t>Security – A big aspect of the built-in functionality that comes with Django is security, with built-in protection against SQL injections, XSS, CSRF, and more. Nothing is needed to set this up or turn this on; it comes set up and turned on out of the box.</w:t>
+      </w:r>
+    </w:p>
+    <w:p>
+      <w:pPr>
+        <w:pStyle w:val="ListParagraph"/>
+        <w:numPr>
+          <w:ilvl w:val="0"/>
+          <w:numId w:val="12"/>
+        </w:numPr>
+        <w:rPr>
+          <w:sz w:val="28"/>
+          <w:szCs w:val="28"/>
+        </w:rPr>
+      </w:pPr>
+      <w:r>
+        <w:rPr>
+          <w:sz w:val="28"/>
+          <w:szCs w:val="28"/>
+        </w:rPr>
+        <w:t>Database support – Django’s ORM approach is one of the best in the industry for working with relational databases.</w:t>
+      </w:r>
+    </w:p>
+    <w:p>
+      <w:pPr>
+        <w:pStyle w:val="ListParagraph"/>
+        <w:numPr>
+          <w:ilvl w:val="0"/>
+          <w:numId w:val="12"/>
+        </w:numPr>
+        <w:rPr>
+          <w:sz w:val="28"/>
+          <w:szCs w:val="28"/>
+        </w:rPr>
+      </w:pPr>
+      <w:r>
+        <w:rPr>
+          <w:sz w:val="28"/>
+          <w:szCs w:val="28"/>
+        </w:rPr>
+        <w:t>Learning curve – Django takes more time and focus to learn due to the strict approach to how things are done and due to all the built-in functionality.</w:t>
+      </w:r>
+    </w:p>
+    <w:p>
+      <w:pPr>
+        <w:pStyle w:val="ListParagraph"/>
+        <w:numPr>
+          <w:ilvl w:val="0"/>
+          <w:numId w:val="12"/>
+        </w:numPr>
+        <w:rPr>
+          <w:sz w:val="28"/>
+          <w:szCs w:val="28"/>
+        </w:rPr>
+      </w:pPr>
+      <w:r>
+        <w:rPr>
+          <w:sz w:val="28"/>
+          <w:szCs w:val="28"/>
+        </w:rPr>
+        <w:lastRenderedPageBreak/>
+        <w:t>Ecosystem – Django uses the Python ecosystem, which is mature, well maintained and has many packages that are heavily used in other areas where Python is popular. This allows easy integration between a Django application or server and these other packages, which can enhance the server functionality.</w:t>
+      </w:r>
+    </w:p>
+    <w:p>
+      <w:pPr>
+        <w:ind w:left="360"/>
+        <w:rPr>
+          <w:sz w:val="28"/>
+          <w:szCs w:val="28"/>
+        </w:rPr>
+      </w:pPr>
+      <w:r>
+        <w:rPr>
+          <w:sz w:val="28"/>
+          <w:szCs w:val="28"/>
+        </w:rPr>
+        <w:t>Flask:</w:t>
+      </w:r>
+    </w:p>
+    <w:p>
+      <w:pPr>
+        <w:pStyle w:val="ListParagraph"/>
+        <w:numPr>
+          <w:ilvl w:val="0"/>
+          <w:numId w:val="13"/>
+        </w:numPr>
+        <w:rPr>
+          <w:sz w:val="28"/>
+          <w:szCs w:val="28"/>
+        </w:rPr>
+      </w:pPr>
+      <w:r>
+        <w:rPr>
+          <w:sz w:val="28"/>
+          <w:szCs w:val="28"/>
+        </w:rPr>
+        <w:t xml:space="preserve">Development speed – </w:t>
+      </w:r>
+      <w:r>
+        <w:rPr>
+          <w:sz w:val="28"/>
+          <w:szCs w:val="28"/>
+        </w:rPr>
+        <w:t>Flask is very fast for initial setup and small applications, but development speed slows down with an application’s complexity. This is due to the need for connecting other packages and services to the Flask application.</w:t>
+      </w:r>
+    </w:p>
+    <w:p>
+      <w:pPr>
+        <w:pStyle w:val="ListParagraph"/>
+        <w:numPr>
+          <w:ilvl w:val="0"/>
+          <w:numId w:val="13"/>
+        </w:numPr>
+        <w:rPr>
+          <w:sz w:val="28"/>
+          <w:szCs w:val="28"/>
+        </w:rPr>
+      </w:pPr>
+      <w:r>
+        <w:rPr>
+          <w:sz w:val="28"/>
+          <w:szCs w:val="28"/>
+        </w:rPr>
+        <w:t xml:space="preserve">Scalability – </w:t>
+      </w:r>
+      <w:r>
+        <w:rPr>
+          <w:sz w:val="28"/>
+          <w:szCs w:val="28"/>
+        </w:rPr>
+        <w:t>Flask also scales well horizontally but in a different way than Django. Due to its small footprint, Flask can be used in a microservice architecture.</w:t>
+      </w:r>
+    </w:p>
+    <w:p>
+      <w:pPr>
+        <w:pStyle w:val="ListParagraph"/>
+        <w:numPr>
+          <w:ilvl w:val="0"/>
+          <w:numId w:val="13"/>
+        </w:numPr>
+        <w:rPr>
+          <w:sz w:val="28"/>
+          <w:szCs w:val="28"/>
+        </w:rPr>
+      </w:pPr>
+      <w:r>
+        <w:rPr>
+          <w:sz w:val="28"/>
+          <w:szCs w:val="28"/>
+        </w:rPr>
+        <w:t xml:space="preserve">Security – </w:t>
+      </w:r>
+      <w:r>
+        <w:rPr>
+          <w:sz w:val="28"/>
+          <w:szCs w:val="28"/>
+        </w:rPr>
+        <w:t>Flask doesn’t provide built-in and “turned on by default” security, but requires developers to set up their own security.</w:t>
+      </w:r>
+    </w:p>
+    <w:p>
+      <w:pPr>
+        <w:pStyle w:val="ListParagraph"/>
+        <w:numPr>
+          <w:ilvl w:val="0"/>
+          <w:numId w:val="13"/>
+        </w:numPr>
+        <w:rPr>
+          <w:sz w:val="28"/>
+          <w:szCs w:val="28"/>
+        </w:rPr>
+      </w:pPr>
+      <w:r>
+        <w:rPr>
+          <w:sz w:val="28"/>
+          <w:szCs w:val="28"/>
+        </w:rPr>
+        <w:t xml:space="preserve">Database support – </w:t>
+      </w:r>
+      <w:r>
+        <w:rPr>
+          <w:sz w:val="28"/>
+          <w:szCs w:val="28"/>
+        </w:rPr>
+        <w:t>Flask is flexible and has some third-party packages that allow it to work with SQL and NoSQL databases of different types.</w:t>
+      </w:r>
+    </w:p>
+    <w:p>
+      <w:pPr>
+        <w:pStyle w:val="ListParagraph"/>
+        <w:numPr>
+          <w:ilvl w:val="0"/>
+          <w:numId w:val="13"/>
+        </w:numPr>
+        <w:rPr>
+          <w:sz w:val="28"/>
+          <w:szCs w:val="28"/>
+        </w:rPr>
+      </w:pPr>
+      <w:r>
+        <w:rPr>
+          <w:sz w:val="28"/>
+          <w:szCs w:val="28"/>
+        </w:rPr>
+        <w:t xml:space="preserve">Learning curve – </w:t>
+      </w:r>
+      <w:r>
+        <w:rPr>
+          <w:sz w:val="28"/>
+          <w:szCs w:val="28"/>
+        </w:rPr>
+        <w:t>Flask is fairly easy to learn and is also a good starting point for an introduction to backend web development.</w:t>
+      </w:r>
+    </w:p>
+    <w:p>
+      <w:pPr>
+        <w:pStyle w:val="ListParagraph"/>
+        <w:numPr>
+          <w:ilvl w:val="0"/>
+          <w:numId w:val="13"/>
+        </w:numPr>
+        <w:rPr>
+          <w:sz w:val="28"/>
+          <w:szCs w:val="28"/>
+        </w:rPr>
+      </w:pPr>
+      <w:r>
+        <w:rPr>
+          <w:sz w:val="28"/>
+          <w:szCs w:val="28"/>
+        </w:rPr>
+        <w:t xml:space="preserve">Ecosystem – </w:t>
+      </w:r>
+      <w:r>
+        <w:rPr>
+          <w:sz w:val="28"/>
+          <w:szCs w:val="28"/>
+        </w:rPr>
+        <w:t>Flask also</w:t>
+      </w:r>
+      <w:r>
+        <w:rPr>
+          <w:sz w:val="28"/>
+          <w:szCs w:val="28"/>
+        </w:rPr>
+        <w:t xml:space="preserve"> uses the Python ecosystem, which is mature, well maintained and has many packages that are heavily used in other areas where Python is popular. </w:t>
+      </w:r>
+      <w:r>
+        <w:rPr>
+          <w:sz w:val="28"/>
+          <w:szCs w:val="28"/>
+        </w:rPr>
+        <w:t>However, because Flask is small, many of the built-in functionality that Django provides needs to be provided by other Python packages.</w:t>
+      </w:r>
+    </w:p>
+    <w:p>
+      <w:pPr>
+        <w:ind w:left="360"/>
+        <w:rPr>
+          <w:sz w:val="28"/>
+          <w:szCs w:val="28"/>
+        </w:rPr>
+      </w:pPr>
+      <w:r>
+        <w:rPr>
+          <w:sz w:val="28"/>
+          <w:szCs w:val="28"/>
+        </w:rPr>
+        <w:t>Node/Express:</w:t>
+      </w:r>
+    </w:p>
+    <w:p>
+      <w:pPr>
+        <w:pStyle w:val="ListParagraph"/>
+        <w:numPr>
+          <w:ilvl w:val="0"/>
+          <w:numId w:val="14"/>
+        </w:numPr>
+        <w:rPr>
+          <w:sz w:val="28"/>
+          <w:szCs w:val="28"/>
+        </w:rPr>
+      </w:pPr>
+      <w:r>
+        <w:rPr>
+          <w:sz w:val="28"/>
+          <w:szCs w:val="28"/>
+        </w:rPr>
+        <w:t xml:space="preserve">Development speed – </w:t>
+      </w:r>
+      <w:r>
+        <w:rPr>
+          <w:sz w:val="28"/>
+          <w:szCs w:val="28"/>
+        </w:rPr>
+        <w:t>Node/Express development is slower than Django or Flask because Express is a very minimalist web framework. A lot of the lower level layers that Django provides need to be manually programmed in with Express.</w:t>
+      </w:r>
+    </w:p>
+    <w:p>
+      <w:pPr>
+        <w:pStyle w:val="ListParagraph"/>
+        <w:numPr>
+          <w:ilvl w:val="0"/>
+          <w:numId w:val="14"/>
+        </w:numPr>
+        <w:rPr>
+          <w:sz w:val="28"/>
+          <w:szCs w:val="28"/>
+        </w:rPr>
+      </w:pPr>
+      <w:r>
+        <w:rPr>
+          <w:sz w:val="28"/>
+          <w:szCs w:val="28"/>
+        </w:rPr>
+        <w:t xml:space="preserve">Scalability – </w:t>
+      </w:r>
+      <w:r>
+        <w:rPr>
+          <w:sz w:val="28"/>
+          <w:szCs w:val="28"/>
+        </w:rPr>
+        <w:t xml:space="preserve">Node is known for high concurrency capabilities due to its asynchronous event loop. This allows for quick vertical scaling without needing to start multiple instances of the server. </w:t>
+      </w:r>
+    </w:p>
+    <w:p>
+      <w:pPr>
+        <w:pStyle w:val="ListParagraph"/>
+        <w:numPr>
+          <w:ilvl w:val="0"/>
+          <w:numId w:val="14"/>
+        </w:numPr>
+        <w:rPr>
+          <w:sz w:val="28"/>
+          <w:szCs w:val="28"/>
+        </w:rPr>
+      </w:pPr>
+      <w:r>
+        <w:rPr>
+          <w:sz w:val="28"/>
+          <w:szCs w:val="28"/>
+        </w:rPr>
+        <w:lastRenderedPageBreak/>
+        <w:t xml:space="preserve">Security – </w:t>
+      </w:r>
+      <w:r>
+        <w:rPr>
+          <w:sz w:val="28"/>
+          <w:szCs w:val="28"/>
+        </w:rPr>
+        <w:t xml:space="preserve">Similarly to Flask, Express requires the developer to set up and program in their own security functionality. </w:t>
+      </w:r>
+    </w:p>
+    <w:p>
+      <w:pPr>
+        <w:pStyle w:val="ListParagraph"/>
+        <w:numPr>
+          <w:ilvl w:val="0"/>
+          <w:numId w:val="14"/>
+        </w:numPr>
+        <w:rPr>
+          <w:sz w:val="28"/>
+          <w:szCs w:val="28"/>
+        </w:rPr>
+      </w:pPr>
+      <w:r>
+        <w:rPr>
+          <w:sz w:val="28"/>
+          <w:szCs w:val="28"/>
+        </w:rPr>
+        <w:t xml:space="preserve">Database support – </w:t>
+      </w:r>
+      <w:r>
+        <w:rPr>
+          <w:sz w:val="28"/>
+          <w:szCs w:val="28"/>
+        </w:rPr>
+        <w:t>Express works well with and is commonly paired with NoSQL databases.</w:t>
+      </w:r>
+    </w:p>
+    <w:p>
+      <w:pPr>
+        <w:pStyle w:val="ListParagraph"/>
+        <w:numPr>
+          <w:ilvl w:val="0"/>
+          <w:numId w:val="14"/>
+        </w:numPr>
+        <w:rPr>
+          <w:sz w:val="28"/>
+          <w:szCs w:val="28"/>
+        </w:rPr>
+      </w:pPr>
+      <w:r>
+        <w:rPr>
+          <w:sz w:val="28"/>
+          <w:szCs w:val="28"/>
+        </w:rPr>
+        <w:t xml:space="preserve">Learning curve – </w:t>
+      </w:r>
+      <w:r>
+        <w:rPr>
+          <w:sz w:val="28"/>
+          <w:szCs w:val="28"/>
+        </w:rPr>
+        <w:t>If a developer already knows JavaScript, then Node and Express are relatively easy to learn, with the asynchronous approach possibly being the most challenging aspect to learn.</w:t>
+      </w:r>
+    </w:p>
+    <w:p>
+      <w:pPr>
+        <w:pStyle w:val="ListParagraph"/>
+        <w:numPr>
+          <w:ilvl w:val="0"/>
+          <w:numId w:val="14"/>
+        </w:numPr>
+        <w:rPr>
+          <w:sz w:val="28"/>
+          <w:szCs w:val="28"/>
+        </w:rPr>
+      </w:pPr>
+      <w:r>
+        <w:rPr>
+          <w:sz w:val="28"/>
+          <w:szCs w:val="28"/>
+        </w:rPr>
+        <w:t xml:space="preserve">Ecosystem – </w:t>
+      </w:r>
+      <w:r>
+        <w:rPr>
+          <w:sz w:val="28"/>
+          <w:szCs w:val="28"/>
+        </w:rPr>
+        <w:t xml:space="preserve">Node uses the Node Package Manager and the Node ecosystem, which is also very mature and has many packages, like with Python. However, due to JavaScript not being typically used in certain fields, it may be challenging to have an Express application </w:t>
+      </w:r>
+      <w:r>
+        <w:rPr>
+          <w:sz w:val="28"/>
+          <w:szCs w:val="28"/>
+        </w:rPr>
+        <w:t>provide certain functionality. On the other hand, Express can pair well with frontend technologies built on JavaScript, like React, Vue, etc.</w:t>
       </w:r>
     </w:p>
     <w:p>
@@ -1188,7 +1687,29 @@
           <w:sz w:val="28"/>
           <w:szCs w:val="28"/>
         </w:rPr>
-        <w:t>Answer here.</w:t>
+        <w:t>Django is still relevant for modern software development, but like all other technologies, it has its specific use cases. Because Django is based in Python, applications that require integration with other areas where Python shines – such as AI, ML, data handling, etc. – will benefit from being developed in Django. Django’s out-of-the-box built-in functionality also makes it a good choice for applications that will work with a lot of data in its backend, such as modelling and manipulating relational database schemas and tables.</w:t>
+      </w:r>
+    </w:p>
+    <w:p>
+      <w:pPr>
+        <w:rPr>
+          <w:sz w:val="28"/>
+          <w:szCs w:val="28"/>
+        </w:rPr>
+      </w:pPr>
+      <w:r>
+        <w:rPr>
+          <w:sz w:val="28"/>
+          <w:szCs w:val="28"/>
+        </w:rPr>
+        <w:t>Personally, I would choose Django for a new project today because I am already well versed in Python and familiar with Django. I also find Django’s structured approach easier to work with enabling me to more focus on my application logic and frontend UI.</w:t>
+      </w:r>
+      <w:r>
+        <w:rPr>
+          <w:sz w:val="28"/>
+          <w:szCs w:val="28"/>
+        </w:rPr>
+        <w:t xml:space="preserve"> I also like that Django is used in hybrid setups where Django functions as a headless API server, with the frontend UI being built in other technologies better geared for UI/UX development.</w:t>
       </w:r>
     </w:p>
     <w:sectPr>
@@ -1405,6 +1926,95 @@
     </w:lvl>
   </w:abstractNum>
   <w:abstractNum w:abstractNumId="2" w15:restartNumberingAfterBreak="0">
+    <w:nsid w:val="15F51E68"/>
+    <w:multiLevelType w:val="hybridMultilevel"/>
+    <w:tmpl w:val="97EE1E4A"/>
+    <w:lvl w:ilvl="0" w:tplc="FFFFFFFF">
+      <w:start w:val="1"/>
+      <w:numFmt w:val="lowerLetter"/>
+      <w:lvlText w:val="%1."/>
+      <w:lvlJc w:val="left"/>
+      <w:pPr>
+        <w:ind w:left="720" w:hanging="360"/>
+      </w:pPr>
+      <w:rPr>
+        <w:rFonts w:hint="default"/>
+      </w:rPr>
+    </w:lvl>
+    <w:lvl w:ilvl="1" w:tplc="FFFFFFFF" w:tentative="1">
+      <w:start w:val="1"/>
+      <w:numFmt w:val="lowerLetter"/>
+      <w:lvlText w:val="%2."/>
+      <w:lvlJc w:val="left"/>
+      <w:pPr>
+        <w:ind w:left="1440" w:hanging="360"/>
+      </w:pPr>
+    </w:lvl>
+    <w:lvl w:ilvl="2" w:tplc="FFFFFFFF" w:tentative="1">
+      <w:start w:val="1"/>
+      <w:numFmt w:val="lowerRoman"/>
+      <w:lvlText w:val="%3."/>
+      <w:lvlJc w:val="right"/>
+      <w:pPr>
+        <w:ind w:left="2160" w:hanging="180"/>
+      </w:pPr>
+    </w:lvl>
+    <w:lvl w:ilvl="3" w:tplc="FFFFFFFF" w:tentative="1">
+      <w:start w:val="1"/>
+      <w:numFmt w:val="decimal"/>
+      <w:lvlText w:val="%4."/>
+      <w:lvlJc w:val="left"/>
+      <w:pPr>
+        <w:ind w:left="2880" w:hanging="360"/>
+      </w:pPr>
+    </w:lvl>
+    <w:lvl w:ilvl="4" w:tplc="FFFFFFFF" w:tentative="1">
+      <w:start w:val="1"/>
+      <w:numFmt w:val="lowerLetter"/>
+      <w:lvlText w:val="%5."/>
+      <w:lvlJc w:val="left"/>
+      <w:pPr>
+        <w:ind w:left="3600" w:hanging="360"/>
+      </w:pPr>
+    </w:lvl>
+    <w:lvl w:ilvl="5" w:tplc="FFFFFFFF" w:tentative="1">
+      <w:start w:val="1"/>
+      <w:numFmt w:val="lowerRoman"/>
+      <w:lvlText w:val="%6."/>
+      <w:lvlJc w:val="right"/>
+      <w:pPr>
+        <w:ind w:left="4320" w:hanging="180"/>
+      </w:pPr>
+    </w:lvl>
+    <w:lvl w:ilvl="6" w:tplc="FFFFFFFF" w:tentative="1">
+      <w:start w:val="1"/>
+      <w:numFmt w:val="decimal"/>
+      <w:lvlText w:val="%7."/>
+      <w:lvlJc w:val="left"/>
+      <w:pPr>
+        <w:ind w:left="5040" w:hanging="360"/>
+      </w:pPr>
+    </w:lvl>
+    <w:lvl w:ilvl="7" w:tplc="FFFFFFFF" w:tentative="1">
+      <w:start w:val="1"/>
+      <w:numFmt w:val="lowerLetter"/>
+      <w:lvlText w:val="%8."/>
+      <w:lvlJc w:val="left"/>
+      <w:pPr>
+        <w:ind w:left="5760" w:hanging="360"/>
+      </w:pPr>
+    </w:lvl>
+    <w:lvl w:ilvl="8" w:tplc="FFFFFFFF" w:tentative="1">
+      <w:start w:val="1"/>
+      <w:numFmt w:val="lowerRoman"/>
+      <w:lvlText w:val="%9."/>
+      <w:lvlJc w:val="right"/>
+      <w:pPr>
+        <w:ind w:left="6480" w:hanging="180"/>
+      </w:pPr>
+    </w:lvl>
+  </w:abstractNum>
+  <w:abstractNum w:abstractNumId="3" w15:restartNumberingAfterBreak="0">
     <w:nsid w:val="17792D01"/>
     <w:multiLevelType w:val="hybridMultilevel"/>
     <w:tmpl w:val="9B940576"/>
@@ -1490,7 +2100,7 @@
       </w:pPr>
     </w:lvl>
   </w:abstractNum>
-  <w:abstractNum w:abstractNumId="3" w15:restartNumberingAfterBreak="0">
+  <w:abstractNum w:abstractNumId="4" w15:restartNumberingAfterBreak="0">
     <w:nsid w:val="35DE324D"/>
     <w:multiLevelType w:val="hybridMultilevel"/>
     <w:tmpl w:val="226E48A0"/>
@@ -1579,7 +2189,7 @@
       </w:pPr>
     </w:lvl>
   </w:abstractNum>
-  <w:abstractNum w:abstractNumId="4" w15:restartNumberingAfterBreak="0">
+  <w:abstractNum w:abstractNumId="5" w15:restartNumberingAfterBreak="0">
     <w:nsid w:val="3936021B"/>
     <w:multiLevelType w:val="hybridMultilevel"/>
     <w:tmpl w:val="043CDAD4"/>
@@ -1668,7 +2278,7 @@
       </w:pPr>
     </w:lvl>
   </w:abstractNum>
-  <w:abstractNum w:abstractNumId="5" w15:restartNumberingAfterBreak="0">
+  <w:abstractNum w:abstractNumId="6" w15:restartNumberingAfterBreak="0">
     <w:nsid w:val="3FB0007E"/>
     <w:multiLevelType w:val="hybridMultilevel"/>
     <w:tmpl w:val="9EF46354"/>
@@ -1757,7 +2367,96 @@
       </w:pPr>
     </w:lvl>
   </w:abstractNum>
-  <w:abstractNum w:abstractNumId="6" w15:restartNumberingAfterBreak="0">
+  <w:abstractNum w:abstractNumId="7" w15:restartNumberingAfterBreak="0">
+    <w:nsid w:val="4AB95EEE"/>
+    <w:multiLevelType w:val="hybridMultilevel"/>
+    <w:tmpl w:val="97EE1E4A"/>
+    <w:lvl w:ilvl="0" w:tplc="10090019">
+      <w:start w:val="1"/>
+      <w:numFmt w:val="lowerLetter"/>
+      <w:lvlText w:val="%1."/>
+      <w:lvlJc w:val="left"/>
+      <w:pPr>
+        <w:ind w:left="720" w:hanging="360"/>
+      </w:pPr>
+      <w:rPr>
+        <w:rFonts w:hint="default"/>
+      </w:rPr>
+    </w:lvl>
+    <w:lvl w:ilvl="1" w:tplc="10090019" w:tentative="1">
+      <w:start w:val="1"/>
+      <w:numFmt w:val="lowerLetter"/>
+      <w:lvlText w:val="%2."/>
+      <w:lvlJc w:val="left"/>
+      <w:pPr>
+        <w:ind w:left="1440" w:hanging="360"/>
+      </w:pPr>
+    </w:lvl>
+    <w:lvl w:ilvl="2" w:tplc="1009001B" w:tentative="1">
+      <w:start w:val="1"/>
+      <w:numFmt w:val="lowerRoman"/>
+      <w:lvlText w:val="%3."/>
+      <w:lvlJc w:val="right"/>
+      <w:pPr>
+        <w:ind w:left="2160" w:hanging="180"/>
+      </w:pPr>
+    </w:lvl>
+    <w:lvl w:ilvl="3" w:tplc="1009000F" w:tentative="1">
+      <w:start w:val="1"/>
+      <w:numFmt w:val="decimal"/>
+      <w:lvlText w:val="%4."/>
+      <w:lvlJc w:val="left"/>
+      <w:pPr>
+        <w:ind w:left="2880" w:hanging="360"/>
+      </w:pPr>
+    </w:lvl>
+    <w:lvl w:ilvl="4" w:tplc="10090019" w:tentative="1">
+      <w:start w:val="1"/>
+      <w:numFmt w:val="lowerLetter"/>
+      <w:lvlText w:val="%5."/>
+      <w:lvlJc w:val="left"/>
+      <w:pPr>
+        <w:ind w:left="3600" w:hanging="360"/>
+      </w:pPr>
+    </w:lvl>
+    <w:lvl w:ilvl="5" w:tplc="1009001B" w:tentative="1">
+      <w:start w:val="1"/>
+      <w:numFmt w:val="lowerRoman"/>
+      <w:lvlText w:val="%6."/>
+      <w:lvlJc w:val="right"/>
+      <w:pPr>
+        <w:ind w:left="4320" w:hanging="180"/>
+      </w:pPr>
+    </w:lvl>
+    <w:lvl w:ilvl="6" w:tplc="1009000F" w:tentative="1">
+      <w:start w:val="1"/>
+      <w:numFmt w:val="decimal"/>
+      <w:lvlText w:val="%7."/>
+      <w:lvlJc w:val="left"/>
+      <w:pPr>
+        <w:ind w:left="5040" w:hanging="360"/>
+      </w:pPr>
+    </w:lvl>
+    <w:lvl w:ilvl="7" w:tplc="10090019" w:tentative="1">
+      <w:start w:val="1"/>
+      <w:numFmt w:val="lowerLetter"/>
+      <w:lvlText w:val="%8."/>
+      <w:lvlJc w:val="left"/>
+      <w:pPr>
+        <w:ind w:left="5760" w:hanging="360"/>
+      </w:pPr>
+    </w:lvl>
+    <w:lvl w:ilvl="8" w:tplc="1009001B" w:tentative="1">
+      <w:start w:val="1"/>
+      <w:numFmt w:val="lowerRoman"/>
+      <w:lvlText w:val="%9."/>
+      <w:lvlJc w:val="right"/>
+      <w:pPr>
+        <w:ind w:left="6480" w:hanging="180"/>
+      </w:pPr>
+    </w:lvl>
+  </w:abstractNum>
+  <w:abstractNum w:abstractNumId="8" w15:restartNumberingAfterBreak="0">
     <w:nsid w:val="619B3246"/>
     <w:multiLevelType w:val="hybridMultilevel"/>
     <w:tmpl w:val="DA56CAB8"/>
@@ -1846,7 +2545,7 @@
       </w:pPr>
     </w:lvl>
   </w:abstractNum>
-  <w:abstractNum w:abstractNumId="7" w15:restartNumberingAfterBreak="0">
+  <w:abstractNum w:abstractNumId="9" w15:restartNumberingAfterBreak="0">
     <w:nsid w:val="65204C84"/>
     <w:multiLevelType w:val="hybridMultilevel"/>
     <w:tmpl w:val="71AA14FA"/>
@@ -1935,7 +2634,96 @@
       </w:pPr>
     </w:lvl>
   </w:abstractNum>
-  <w:abstractNum w:abstractNumId="8" w15:restartNumberingAfterBreak="0">
+  <w:abstractNum w:abstractNumId="10" w15:restartNumberingAfterBreak="0">
+    <w:nsid w:val="6D2F7100"/>
+    <w:multiLevelType w:val="hybridMultilevel"/>
+    <w:tmpl w:val="97EE1E4A"/>
+    <w:lvl w:ilvl="0" w:tplc="FFFFFFFF">
+      <w:start w:val="1"/>
+      <w:numFmt w:val="lowerLetter"/>
+      <w:lvlText w:val="%1."/>
+      <w:lvlJc w:val="left"/>
+      <w:pPr>
+        <w:ind w:left="720" w:hanging="360"/>
+      </w:pPr>
+      <w:rPr>
+        <w:rFonts w:hint="default"/>
+      </w:rPr>
+    </w:lvl>
+    <w:lvl w:ilvl="1" w:tplc="FFFFFFFF" w:tentative="1">
+      <w:start w:val="1"/>
+      <w:numFmt w:val="lowerLetter"/>
+      <w:lvlText w:val="%2."/>
+      <w:lvlJc w:val="left"/>
+      <w:pPr>
+        <w:ind w:left="1440" w:hanging="360"/>
+      </w:pPr>
+    </w:lvl>
+    <w:lvl w:ilvl="2" w:tplc="FFFFFFFF" w:tentative="1">
+      <w:start w:val="1"/>
+      <w:numFmt w:val="lowerRoman"/>
+      <w:lvlText w:val="%3."/>
+      <w:lvlJc w:val="right"/>
+      <w:pPr>
+        <w:ind w:left="2160" w:hanging="180"/>
+      </w:pPr>
+    </w:lvl>
+    <w:lvl w:ilvl="3" w:tplc="FFFFFFFF" w:tentative="1">
+      <w:start w:val="1"/>
+      <w:numFmt w:val="decimal"/>
+      <w:lvlText w:val="%4."/>
+      <w:lvlJc w:val="left"/>
+      <w:pPr>
+        <w:ind w:left="2880" w:hanging="360"/>
+      </w:pPr>
+    </w:lvl>
+    <w:lvl w:ilvl="4" w:tplc="FFFFFFFF" w:tentative="1">
+      <w:start w:val="1"/>
+      <w:numFmt w:val="lowerLetter"/>
+      <w:lvlText w:val="%5."/>
+      <w:lvlJc w:val="left"/>
+      <w:pPr>
+        <w:ind w:left="3600" w:hanging="360"/>
+      </w:pPr>
+    </w:lvl>
+    <w:lvl w:ilvl="5" w:tplc="FFFFFFFF" w:tentative="1">
+      <w:start w:val="1"/>
+      <w:numFmt w:val="lowerRoman"/>
+      <w:lvlText w:val="%6."/>
+      <w:lvlJc w:val="right"/>
+      <w:pPr>
+        <w:ind w:left="4320" w:hanging="180"/>
+      </w:pPr>
+    </w:lvl>
+    <w:lvl w:ilvl="6" w:tplc="FFFFFFFF" w:tentative="1">
+      <w:start w:val="1"/>
+      <w:numFmt w:val="decimal"/>
+      <w:lvlText w:val="%7."/>
+      <w:lvlJc w:val="left"/>
+      <w:pPr>
+        <w:ind w:left="5040" w:hanging="360"/>
+      </w:pPr>
+    </w:lvl>
+    <w:lvl w:ilvl="7" w:tplc="FFFFFFFF" w:tentative="1">
+      <w:start w:val="1"/>
+      <w:numFmt w:val="lowerLetter"/>
+      <w:lvlText w:val="%8."/>
+      <w:lvlJc w:val="left"/>
+      <w:pPr>
+        <w:ind w:left="5760" w:hanging="360"/>
+      </w:pPr>
+    </w:lvl>
+    <w:lvl w:ilvl="8" w:tplc="FFFFFFFF" w:tentative="1">
+      <w:start w:val="1"/>
+      <w:numFmt w:val="lowerRoman"/>
+      <w:lvlText w:val="%9."/>
+      <w:lvlJc w:val="right"/>
+      <w:pPr>
+        <w:ind w:left="6480" w:hanging="180"/>
+      </w:pPr>
+    </w:lvl>
+  </w:abstractNum>
+  <w:abstractNum w:abstractNumId="11" w15:restartNumberingAfterBreak="0">
     <w:nsid w:val="70261EF9"/>
     <w:multiLevelType w:val="hybridMultilevel"/>
     <w:tmpl w:val="A7F60F9A"/>
@@ -2024,7 +2812,7 @@
       </w:pPr>
     </w:lvl>
   </w:abstractNum>
-  <w:abstractNum w:abstractNumId="9" w15:restartNumberingAfterBreak="0">
+  <w:abstractNum w:abstractNumId="12" w15:restartNumberingAfterBreak="0">
     <w:nsid w:val="7A9B6FB8"/>
     <w:multiLevelType w:val="hybridMultilevel"/>
     <w:tmpl w:val="51A464C8"/>
@@ -2113,7 +2901,7 @@
       </w:pPr>
     </w:lvl>
   </w:abstractNum>
-  <w:abstractNum w:abstractNumId="10" w15:restartNumberingAfterBreak="0">
+  <w:abstractNum w:abstractNumId="13" w15:restartNumberingAfterBreak="0">
     <w:nsid w:val="7F610334"/>
     <w:multiLevelType w:val="hybridMultilevel"/>
     <w:tmpl w:val="3E6E5ECC"/>
@@ -2203,37 +2991,46 @@
     </w:lvl>
   </w:abstractNum>
   <w:num w:numId="1" w16cid:durableId="1837113513">
-    <w:abstractNumId w:val="9"/>
+    <w:abstractNumId w:val="12"/>
   </w:num>
   <w:num w:numId="2" w16cid:durableId="725224361">
     <w:abstractNumId w:val="0"/>
   </w:num>
   <w:num w:numId="3" w16cid:durableId="704602765">
-    <w:abstractNumId w:val="10"/>
+    <w:abstractNumId w:val="13"/>
   </w:num>
   <w:num w:numId="4" w16cid:durableId="1484738448">
-    <w:abstractNumId w:val="4"/>
+    <w:abstractNumId w:val="5"/>
   </w:num>
   <w:num w:numId="5" w16cid:durableId="1721201291">
-    <w:abstractNumId w:val="2"/>
+    <w:abstractNumId w:val="3"/>
   </w:num>
   <w:num w:numId="6" w16cid:durableId="329722513">
     <w:abstractNumId w:val="1"/>
   </w:num>
   <w:num w:numId="7" w16cid:durableId="1803769546">
+    <w:abstractNumId w:val="11"/>
+  </w:num>
+  <w:num w:numId="8" w16cid:durableId="1174106815">
+    <w:abstractNumId w:val="6"/>
+  </w:num>
+  <w:num w:numId="9" w16cid:durableId="830557741">
     <w:abstractNumId w:val="8"/>
   </w:num>
-  <w:num w:numId="8" w16cid:durableId="1174106815">
-    <w:abstractNumId w:val="5"/>
-  </w:num>
-  <w:num w:numId="9" w16cid:durableId="830557741">
-    <w:abstractNumId w:val="6"/>
-  </w:num>
   <w:num w:numId="10" w16cid:durableId="1942106118">
-    <w:abstractNumId w:val="3"/>
+    <w:abstractNumId w:val="4"/>
   </w:num>
   <w:num w:numId="11" w16cid:durableId="1787961844">
+    <w:abstractNumId w:val="9"/>
+  </w:num>
+  <w:num w:numId="12" w16cid:durableId="1404110019">
     <w:abstractNumId w:val="7"/>
+  </w:num>
+  <w:num w:numId="13" w16cid:durableId="608126915">
+    <w:abstractNumId w:val="2"/>
+  </w:num>
+  <w:num w:numId="14" w16cid:durableId="1305888896">
+    <w:abstractNumId w:val="10"/>
   </w:num>
 </w:numbering>
 </file>

</xml_diff>